<commit_message>
lab04: generate own screenshots and rebuild release artifacts
</commit_message>
<xml_diff>
--- a/labs/lab04/release/simulation-modeling--lab04--report.docx
+++ b/labs/lab04/release/simulation-modeling--lab04--report.docx
@@ -1346,7 +1346,7 @@
       <w:r>
         <w:drawing>
           <wp:inline>
-            <wp:extent cx="3733800" cy="2489200"/>
+            <wp:extent cx="3733800" cy="2100262"/>
             <wp:effectExtent b="0" l="0" r="0" t="0"/>
             <wp:docPr descr="Запуск Julia REPL" title="" id="18" name="Picture"/>
             <a:graphic>
@@ -1367,7 +1367,7 @@
                   <pic:spPr bwMode="auto">
                     <a:xfrm>
                       <a:off x="0" y="0"/>
-                      <a:ext cx="3733800" cy="2489200"/>
+                      <a:ext cx="3733800" cy="2100262"/>
                     </a:xfrm>
                     <a:prstGeom prst="rect">
                       <a:avLst/>
@@ -1403,7 +1403,7 @@
       <w:r>
         <w:drawing>
           <wp:inline>
-            <wp:extent cx="3733800" cy="2489200"/>
+            <wp:extent cx="3733800" cy="2100262"/>
             <wp:effectExtent b="0" l="0" r="0" t="0"/>
             <wp:docPr descr="Подключение пакета DrWatson" title="" id="22" name="Picture"/>
             <a:graphic>
@@ -1424,7 +1424,7 @@
                   <pic:spPr bwMode="auto">
                     <a:xfrm>
                       <a:off x="0" y="0"/>
-                      <a:ext cx="3733800" cy="2489200"/>
+                      <a:ext cx="3733800" cy="2100262"/>
                     </a:xfrm>
                     <a:prstGeom prst="rect">
                       <a:avLst/>
@@ -1460,7 +1460,7 @@
       <w:r>
         <w:drawing>
           <wp:inline>
-            <wp:extent cx="3733800" cy="2489200"/>
+            <wp:extent cx="3733800" cy="2100262"/>
             <wp:effectExtent b="0" l="0" r="0" t="0"/>
             <wp:docPr descr="Создание проекта DrWatson" title="" id="26" name="Picture"/>
             <a:graphic>
@@ -1481,7 +1481,7 @@
                   <pic:spPr bwMode="auto">
                     <a:xfrm>
                       <a:off x="0" y="0"/>
-                      <a:ext cx="3733800" cy="2489200"/>
+                      <a:ext cx="3733800" cy="2100262"/>
                     </a:xfrm>
                     <a:prstGeom prst="rect">
                       <a:avLst/>
@@ -1517,7 +1517,7 @@
       <w:r>
         <w:drawing>
           <wp:inline>
-            <wp:extent cx="3733800" cy="2489200"/>
+            <wp:extent cx="3733800" cy="2100262"/>
             <wp:effectExtent b="0" l="0" r="0" t="0"/>
             <wp:docPr descr="Активация проекта через Pkg.activate" title="" id="30" name="Picture"/>
             <a:graphic>
@@ -1538,7 +1538,7 @@
                   <pic:spPr bwMode="auto">
                     <a:xfrm>
                       <a:off x="0" y="0"/>
-                      <a:ext cx="3733800" cy="2489200"/>
+                      <a:ext cx="3733800" cy="2100262"/>
                     </a:xfrm>
                     <a:prstGeom prst="rect">
                       <a:avLst/>
@@ -1583,7 +1583,7 @@
       <w:r>
         <w:drawing>
           <wp:inline>
-            <wp:extent cx="3733800" cy="2489200"/>
+            <wp:extent cx="3733800" cy="2100262"/>
             <wp:effectExtent b="0" l="0" r="0" t="0"/>
             <wp:docPr descr="Добавление зависимостей проекта" title="" id="34" name="Picture"/>
             <a:graphic>
@@ -1604,7 +1604,7 @@
                   <pic:spPr bwMode="auto">
                     <a:xfrm>
                       <a:off x="0" y="0"/>
-                      <a:ext cx="3733800" cy="2489200"/>
+                      <a:ext cx="3733800" cy="2100262"/>
                     </a:xfrm>
                     <a:prstGeom prst="rect">
                       <a:avLst/>
@@ -1640,7 +1640,7 @@
       <w:r>
         <w:drawing>
           <wp:inline>
-            <wp:extent cx="3733800" cy="2489200"/>
+            <wp:extent cx="3733800" cy="2100262"/>
             <wp:effectExtent b="0" l="0" r="0" t="0"/>
             <wp:docPr descr="Завершение установки пакетов" title="" id="38" name="Picture"/>
             <a:graphic>
@@ -1661,7 +1661,7 @@
                   <pic:spPr bwMode="auto">
                     <a:xfrm>
                       <a:off x="0" y="0"/>
-                      <a:ext cx="3733800" cy="2489200"/>
+                      <a:ext cx="3733800" cy="2100262"/>
                     </a:xfrm>
                     <a:prstGeom prst="rect">
                       <a:avLst/>
@@ -2005,7 +2005,7 @@
       <w:r>
         <w:drawing>
           <wp:inline>
-            <wp:extent cx="3733800" cy="2489200"/>
+            <wp:extent cx="3733800" cy="2100262"/>
             <wp:effectExtent b="0" l="0" r="0" t="0"/>
             <wp:docPr descr="Запуск базового скрипта sir_run_basic.jl" title="" id="45" name="Picture"/>
             <a:graphic>
@@ -2026,7 +2026,7 @@
                   <pic:spPr bwMode="auto">
                     <a:xfrm>
                       <a:off x="0" y="0"/>
-                      <a:ext cx="3733800" cy="2489200"/>
+                      <a:ext cx="3733800" cy="2100262"/>
                     </a:xfrm>
                     <a:prstGeom prst="rect">
                       <a:avLst/>
@@ -2306,7 +2306,7 @@
       <w:r>
         <w:drawing>
           <wp:inline>
-            <wp:extent cx="3733800" cy="2489200"/>
+            <wp:extent cx="3733800" cy="2100262"/>
             <wp:effectExtent b="0" l="0" r="0" t="0"/>
             <wp:docPr descr="График базовой динамики S(t), I(t), R(t) и общей численности" title="" id="49" name="Picture"/>
             <a:graphic>
@@ -2327,7 +2327,7 @@
                   <pic:spPr bwMode="auto">
                     <a:xfrm>
                       <a:off x="0" y="0"/>
-                      <a:ext cx="3733800" cy="2489200"/>
+                      <a:ext cx="3733800" cy="2100262"/>
                     </a:xfrm>
                     <a:prstGeom prst="rect">
                       <a:avLst/>
@@ -2523,7 +2523,7 @@
       <w:r>
         <w:drawing>
           <wp:inline>
-            <wp:extent cx="3733800" cy="2489200"/>
+            <wp:extent cx="3733800" cy="2100262"/>
             <wp:effectExtent b="0" l="0" r="0" t="0"/>
             <wp:docPr descr="Генерация clean-версии базового скрипта" title="" id="53" name="Picture"/>
             <a:graphic>
@@ -2544,7 +2544,7 @@
                   <pic:spPr bwMode="auto">
                     <a:xfrm>
                       <a:off x="0" y="0"/>
-                      <a:ext cx="3733800" cy="2489200"/>
+                      <a:ext cx="3733800" cy="2100262"/>
                     </a:xfrm>
                     <a:prstGeom prst="rect">
                       <a:avLst/>
@@ -2580,7 +2580,7 @@
       <w:r>
         <w:drawing>
           <wp:inline>
-            <wp:extent cx="3733800" cy="2489200"/>
+            <wp:extent cx="3733800" cy="2100262"/>
             <wp:effectExtent b="0" l="0" r="0" t="0"/>
             <wp:docPr descr="Генерация Markdown-документации для базового скрипта" title="" id="57" name="Picture"/>
             <a:graphic>
@@ -2601,7 +2601,7 @@
                   <pic:spPr bwMode="auto">
                     <a:xfrm>
                       <a:off x="0" y="0"/>
-                      <a:ext cx="3733800" cy="2489200"/>
+                      <a:ext cx="3733800" cy="2100262"/>
                     </a:xfrm>
                     <a:prstGeom prst="rect">
                       <a:avLst/>
@@ -2637,7 +2637,7 @@
       <w:r>
         <w:drawing>
           <wp:inline>
-            <wp:extent cx="3733800" cy="2489200"/>
+            <wp:extent cx="3733800" cy="2100262"/>
             <wp:effectExtent b="0" l="0" r="0" t="0"/>
             <wp:docPr descr="Генерация Jupyter notebook для базового скрипта" title="" id="61" name="Picture"/>
             <a:graphic>
@@ -2658,7 +2658,7 @@
                   <pic:spPr bwMode="auto">
                     <a:xfrm>
                       <a:off x="0" y="0"/>
-                      <a:ext cx="3733800" cy="2489200"/>
+                      <a:ext cx="3733800" cy="2100262"/>
                     </a:xfrm>
                     <a:prstGeom prst="rect">
                       <a:avLst/>
@@ -2745,7 +2745,7 @@
       <w:r>
         <w:drawing>
           <wp:inline>
-            <wp:extent cx="3733800" cy="2489200"/>
+            <wp:extent cx="3733800" cy="2100262"/>
             <wp:effectExtent b="0" l="0" r="0" t="0"/>
             <wp:docPr descr="Запуск скрипта sir_scan_beta.jl" title="" id="66" name="Picture"/>
             <a:graphic>
@@ -2766,7 +2766,7 @@
                   <pic:spPr bwMode="auto">
                     <a:xfrm>
                       <a:off x="0" y="0"/>
-                      <a:ext cx="3733800" cy="2489200"/>
+                      <a:ext cx="3733800" cy="2100262"/>
                     </a:xfrm>
                     <a:prstGeom prst="rect">
                       <a:avLst/>
@@ -2873,7 +2873,7 @@
       <w:r>
         <w:drawing>
           <wp:inline>
-            <wp:extent cx="3733800" cy="2489200"/>
+            <wp:extent cx="3733800" cy="2100262"/>
             <wp:effectExtent b="0" l="0" r="0" t="0"/>
             <wp:docPr descr="Зависимость эпидемических показателей от beta" title="" id="70" name="Picture"/>
             <a:graphic>
@@ -2894,7 +2894,7 @@
                   <pic:spPr bwMode="auto">
                     <a:xfrm>
                       <a:off x="0" y="0"/>
-                      <a:ext cx="3733800" cy="2489200"/>
+                      <a:ext cx="3733800" cy="2100262"/>
                     </a:xfrm>
                     <a:prstGeom prst="rect">
                       <a:avLst/>
@@ -3130,7 +3130,7 @@
       <w:r>
         <w:drawing>
           <wp:inline>
-            <wp:extent cx="3733800" cy="2489200"/>
+            <wp:extent cx="3733800" cy="2100262"/>
             <wp:effectExtent b="0" l="0" r="0" t="0"/>
             <wp:docPr descr="CSV-файл с результатами параметрического исследования beta" title="" id="74" name="Picture"/>
             <a:graphic>
@@ -3151,7 +3151,7 @@
                   <pic:spPr bwMode="auto">
                     <a:xfrm>
                       <a:off x="0" y="0"/>
-                      <a:ext cx="3733800" cy="2489200"/>
+                      <a:ext cx="3733800" cy="2100262"/>
                     </a:xfrm>
                     <a:prstGeom prst="rect">
                       <a:avLst/>
@@ -3530,7 +3530,7 @@
       <w:r>
         <w:drawing>
           <wp:inline>
-            <wp:extent cx="3733800" cy="2489200"/>
+            <wp:extent cx="3733800" cy="2100262"/>
             <wp:effectExtent b="0" l="0" r="0" t="0"/>
             <wp:docPr descr="Генерация clean-версии скрипта sir_scan_beta" title="" id="78" name="Picture"/>
             <a:graphic>
@@ -3551,7 +3551,7 @@
                   <pic:spPr bwMode="auto">
                     <a:xfrm>
                       <a:off x="0" y="0"/>
-                      <a:ext cx="3733800" cy="2489200"/>
+                      <a:ext cx="3733800" cy="2100262"/>
                     </a:xfrm>
                     <a:prstGeom prst="rect">
                       <a:avLst/>
@@ -3596,7 +3596,7 @@
       <w:r>
         <w:drawing>
           <wp:inline>
-            <wp:extent cx="3733800" cy="2489200"/>
+            <wp:extent cx="3733800" cy="2100262"/>
             <wp:effectExtent b="0" l="0" r="0" t="0"/>
             <wp:docPr descr="Генерация Jupyter notebook для скрипта sir_scan_beta" title="" id="82" name="Picture"/>
             <a:graphic>
@@ -3617,7 +3617,7 @@
                   <pic:spPr bwMode="auto">
                     <a:xfrm>
                       <a:off x="0" y="0"/>
-                      <a:ext cx="3733800" cy="2489200"/>
+                      <a:ext cx="3733800" cy="2100262"/>
                     </a:xfrm>
                     <a:prstGeom prst="rect">
                       <a:avLst/>
@@ -3662,7 +3662,7 @@
       <w:r>
         <w:drawing>
           <wp:inline>
-            <wp:extent cx="3733800" cy="2489200"/>
+            <wp:extent cx="3733800" cy="2100262"/>
             <wp:effectExtent b="0" l="0" r="0" t="0"/>
             <wp:docPr descr="Генерация Markdown-документации для скрипта sir_scan_beta" title="" id="86" name="Picture"/>
             <a:graphic>
@@ -3683,7 +3683,7 @@
                   <pic:spPr bwMode="auto">
                     <a:xfrm>
                       <a:off x="0" y="0"/>
-                      <a:ext cx="3733800" cy="2489200"/>
+                      <a:ext cx="3733800" cy="2100262"/>
                     </a:xfrm>
                     <a:prstGeom prst="rect">
                       <a:avLst/>
@@ -3767,7 +3767,7 @@
       <w:r>
         <w:drawing>
           <wp:inline>
-            <wp:extent cx="3733800" cy="2489200"/>
+            <wp:extent cx="3733800" cy="2100262"/>
             <wp:effectExtent b="0" l="0" r="0" t="0"/>
             <wp:docPr descr="Запуск скрипта sir_migration_effect.jl" title="" id="91" name="Picture"/>
             <a:graphic>
@@ -3788,7 +3788,7 @@
                   <pic:spPr bwMode="auto">
                     <a:xfrm>
                       <a:off x="0" y="0"/>
-                      <a:ext cx="3733800" cy="2489200"/>
+                      <a:ext cx="3733800" cy="2100262"/>
                     </a:xfrm>
                     <a:prstGeom prst="rect">
                       <a:avLst/>
@@ -3853,7 +3853,7 @@
       <w:r>
         <w:drawing>
           <wp:inline>
-            <wp:extent cx="3733800" cy="2489200"/>
+            <wp:extent cx="3733800" cy="2100262"/>
             <wp:effectExtent b="0" l="0" r="0" t="0"/>
             <wp:docPr descr="График влияния миграции на время и величину пика" title="" id="95" name="Picture"/>
             <a:graphic>
@@ -3874,7 +3874,7 @@
                   <pic:spPr bwMode="auto">
                     <a:xfrm>
                       <a:off x="0" y="0"/>
-                      <a:ext cx="3733800" cy="2489200"/>
+                      <a:ext cx="3733800" cy="2100262"/>
                     </a:xfrm>
                     <a:prstGeom prst="rect">
                       <a:avLst/>
@@ -3997,7 +3997,7 @@
       <w:r>
         <w:drawing>
           <wp:inline>
-            <wp:extent cx="3733800" cy="2489200"/>
+            <wp:extent cx="3733800" cy="2100262"/>
             <wp:effectExtent b="0" l="0" r="0" t="0"/>
             <wp:docPr descr="CSV-файл с результатами исследования миграции" title="" id="99" name="Picture"/>
             <a:graphic>
@@ -4018,7 +4018,7 @@
                   <pic:spPr bwMode="auto">
                     <a:xfrm>
                       <a:off x="0" y="0"/>
-                      <a:ext cx="3733800" cy="2489200"/>
+                      <a:ext cx="3733800" cy="2100262"/>
                     </a:xfrm>
                     <a:prstGeom prst="rect">
                       <a:avLst/>
@@ -4409,7 +4409,7 @@
       <w:r>
         <w:drawing>
           <wp:inline>
-            <wp:extent cx="3733800" cy="2489200"/>
+            <wp:extent cx="3733800" cy="2100262"/>
             <wp:effectExtent b="0" l="0" r="0" t="0"/>
             <wp:docPr descr="Генерация clean-версии для скрипта миграции" title="" id="103" name="Picture"/>
             <a:graphic>
@@ -4430,7 +4430,7 @@
                   <pic:spPr bwMode="auto">
                     <a:xfrm>
                       <a:off x="0" y="0"/>
-                      <a:ext cx="3733800" cy="2489200"/>
+                      <a:ext cx="3733800" cy="2100262"/>
                     </a:xfrm>
                     <a:prstGeom prst="rect">
                       <a:avLst/>
@@ -4466,7 +4466,7 @@
       <w:r>
         <w:drawing>
           <wp:inline>
-            <wp:extent cx="3733800" cy="2489200"/>
+            <wp:extent cx="3733800" cy="2100262"/>
             <wp:effectExtent b="0" l="0" r="0" t="0"/>
             <wp:docPr descr="Генерация Markdown-документации для скрипта миграции" title="" id="107" name="Picture"/>
             <a:graphic>
@@ -4487,7 +4487,7 @@
                   <pic:spPr bwMode="auto">
                     <a:xfrm>
                       <a:off x="0" y="0"/>
-                      <a:ext cx="3733800" cy="2489200"/>
+                      <a:ext cx="3733800" cy="2100262"/>
                     </a:xfrm>
                     <a:prstGeom prst="rect">
                       <a:avLst/>
@@ -4523,7 +4523,7 @@
       <w:r>
         <w:drawing>
           <wp:inline>
-            <wp:extent cx="3733800" cy="2489200"/>
+            <wp:extent cx="3733800" cy="2100262"/>
             <wp:effectExtent b="0" l="0" r="0" t="0"/>
             <wp:docPr descr="Генерация notebook для скрипта миграции" title="" id="111" name="Picture"/>
             <a:graphic>
@@ -4544,7 +4544,7 @@
                   <pic:spPr bwMode="auto">
                     <a:xfrm>
                       <a:off x="0" y="0"/>
-                      <a:ext cx="3733800" cy="2489200"/>
+                      <a:ext cx="3733800" cy="2100262"/>
                     </a:xfrm>
                     <a:prstGeom prst="rect">
                       <a:avLst/>
@@ -4619,7 +4619,7 @@
       <w:r>
         <w:drawing>
           <wp:inline>
-            <wp:extent cx="3733800" cy="2489200"/>
+            <wp:extent cx="3733800" cy="2100262"/>
             <wp:effectExtent b="0" l="0" r="0" t="0"/>
             <wp:docPr descr="Запуск скрипта многокритериальной оптимизации" title="" id="116" name="Picture"/>
             <a:graphic>
@@ -4640,7 +4640,7 @@
                   <pic:spPr bwMode="auto">
                     <a:xfrm>
                       <a:off x="0" y="0"/>
-                      <a:ext cx="3733800" cy="2489200"/>
+                      <a:ext cx="3733800" cy="2100262"/>
                     </a:xfrm>
                     <a:prstGeom prst="rect">
                       <a:avLst/>
@@ -4714,7 +4714,7 @@
       <w:r>
         <w:drawing>
           <wp:inline>
-            <wp:extent cx="3733800" cy="2489200"/>
+            <wp:extent cx="3733800" cy="2100262"/>
             <wp:effectExtent b="0" l="0" r="0" t="0"/>
             <wp:docPr descr="Генерация clean-версии скрипта оптимизации" title="" id="120" name="Picture"/>
             <a:graphic>
@@ -4735,7 +4735,7 @@
                   <pic:spPr bwMode="auto">
                     <a:xfrm>
                       <a:off x="0" y="0"/>
-                      <a:ext cx="3733800" cy="2489200"/>
+                      <a:ext cx="3733800" cy="2100262"/>
                     </a:xfrm>
                     <a:prstGeom prst="rect">
                       <a:avLst/>
@@ -4771,7 +4771,7 @@
       <w:r>
         <w:drawing>
           <wp:inline>
-            <wp:extent cx="3733800" cy="2489200"/>
+            <wp:extent cx="3733800" cy="2100262"/>
             <wp:effectExtent b="0" l="0" r="0" t="0"/>
             <wp:docPr descr="Markdown-документация скрипта оптимизации" title="" id="124" name="Picture"/>
             <a:graphic>
@@ -4792,7 +4792,7 @@
                   <pic:spPr bwMode="auto">
                     <a:xfrm>
                       <a:off x="0" y="0"/>
-                      <a:ext cx="3733800" cy="2489200"/>
+                      <a:ext cx="3733800" cy="2100262"/>
                     </a:xfrm>
                     <a:prstGeom prst="rect">
                       <a:avLst/>
@@ -4828,7 +4828,7 @@
       <w:r>
         <w:drawing>
           <wp:inline>
-            <wp:extent cx="3733800" cy="2489200"/>
+            <wp:extent cx="3733800" cy="2100262"/>
             <wp:effectExtent b="0" l="0" r="0" t="0"/>
             <wp:docPr descr="Jupyter notebook скрипта оптимизации" title="" id="128" name="Picture"/>
             <a:graphic>
@@ -4849,7 +4849,7 @@
                   <pic:spPr bwMode="auto">
                     <a:xfrm>
                       <a:off x="0" y="0"/>
-                      <a:ext cx="3733800" cy="2489200"/>
+                      <a:ext cx="3733800" cy="2100262"/>
                     </a:xfrm>
                     <a:prstGeom prst="rect">
                       <a:avLst/>
@@ -4923,7 +4923,7 @@
       <w:r>
         <w:drawing>
           <wp:inline>
-            <wp:extent cx="3733800" cy="2489200"/>
+            <wp:extent cx="3733800" cy="2100262"/>
             <wp:effectExtent b="0" l="0" r="0" t="0"/>
             <wp:docPr descr="Запуск скрипта итоговой визуализации" title="" id="132" name="Picture"/>
             <a:graphic>
@@ -4944,7 +4944,7 @@
                   <pic:spPr bwMode="auto">
                     <a:xfrm>
                       <a:off x="0" y="0"/>
-                      <a:ext cx="3733800" cy="2489200"/>
+                      <a:ext cx="3733800" cy="2100262"/>
                     </a:xfrm>
                     <a:prstGeom prst="rect">
                       <a:avLst/>
@@ -4980,7 +4980,7 @@
       <w:r>
         <w:drawing>
           <wp:inline>
-            <wp:extent cx="3733800" cy="2489200"/>
+            <wp:extent cx="3733800" cy="2100262"/>
             <wp:effectExtent b="0" l="0" r="0" t="0"/>
             <wp:docPr descr="Сводный график зависимости пика, смертности и выздоровления от beta" title="" id="136" name="Picture"/>
             <a:graphic>
@@ -5001,7 +5001,7 @@
                   <pic:spPr bwMode="auto">
                     <a:xfrm>
                       <a:off x="0" y="0"/>
-                      <a:ext cx="3733800" cy="2489200"/>
+                      <a:ext cx="3733800" cy="2100262"/>
                     </a:xfrm>
                     <a:prstGeom prst="rect">
                       <a:avLst/>
@@ -5127,7 +5127,7 @@
       <w:r>
         <w:drawing>
           <wp:inline>
-            <wp:extent cx="3733800" cy="2489200"/>
+            <wp:extent cx="3733800" cy="2100262"/>
             <wp:effectExtent b="0" l="0" r="0" t="0"/>
             <wp:docPr descr="Генерация clean-версии итоговой визуализации" title="" id="140" name="Picture"/>
             <a:graphic>
@@ -5148,7 +5148,7 @@
                   <pic:spPr bwMode="auto">
                     <a:xfrm>
                       <a:off x="0" y="0"/>
-                      <a:ext cx="3733800" cy="2489200"/>
+                      <a:ext cx="3733800" cy="2100262"/>
                     </a:xfrm>
                     <a:prstGeom prst="rect">
                       <a:avLst/>
@@ -5184,7 +5184,7 @@
       <w:r>
         <w:drawing>
           <wp:inline>
-            <wp:extent cx="3733800" cy="2489200"/>
+            <wp:extent cx="3733800" cy="2100262"/>
             <wp:effectExtent b="0" l="0" r="0" t="0"/>
             <wp:docPr descr="Jupyter notebook итоговой визуализации" title="" id="144" name="Picture"/>
             <a:graphic>
@@ -5205,7 +5205,7 @@
                   <pic:spPr bwMode="auto">
                     <a:xfrm>
                       <a:off x="0" y="0"/>
-                      <a:ext cx="3733800" cy="2489200"/>
+                      <a:ext cx="3733800" cy="2100262"/>
                     </a:xfrm>
                     <a:prstGeom prst="rect">
                       <a:avLst/>
@@ -5241,7 +5241,7 @@
       <w:r>
         <w:drawing>
           <wp:inline>
-            <wp:extent cx="3733800" cy="2489200"/>
+            <wp:extent cx="3733800" cy="2100262"/>
             <wp:effectExtent b="0" l="0" r="0" t="0"/>
             <wp:docPr descr="Markdown-документация итоговой визуализации" title="" id="148" name="Picture"/>
             <a:graphic>
@@ -5262,7 +5262,7 @@
                   <pic:spPr bwMode="auto">
                     <a:xfrm>
                       <a:off x="0" y="0"/>
-                      <a:ext cx="3733800" cy="2489200"/>
+                      <a:ext cx="3733800" cy="2100262"/>
                     </a:xfrm>
                     <a:prstGeom prst="rect">
                       <a:avLst/>
@@ -5666,7 +5666,7 @@
       <w:r>
         <w:drawing>
           <wp:inline>
-            <wp:extent cx="3733800" cy="2489200"/>
+            <wp:extent cx="3733800" cy="2100262"/>
             <wp:effectExtent b="0" l="0" r="0" t="0"/>
             <wp:docPr descr="Запуск скрипта исследования гетерогенности" title="" id="156" name="Picture"/>
             <a:graphic>
@@ -5687,7 +5687,7 @@
                   <pic:spPr bwMode="auto">
                     <a:xfrm>
                       <a:off x="0" y="0"/>
-                      <a:ext cx="3733800" cy="2489200"/>
+                      <a:ext cx="3733800" cy="2100262"/>
                     </a:xfrm>
                     <a:prstGeom prst="rect">
                       <a:avLst/>
@@ -5782,7 +5782,7 @@
       <w:r>
         <w:drawing>
           <wp:inline>
-            <wp:extent cx="3733800" cy="2489200"/>
+            <wp:extent cx="3733800" cy="2100262"/>
             <wp:effectExtent b="0" l="0" r="0" t="0"/>
             <wp:docPr descr="График динамики по городам при неоднородных параметрах" title="" id="160" name="Picture"/>
             <a:graphic>
@@ -5803,7 +5803,7 @@
                   <pic:spPr bwMode="auto">
                     <a:xfrm>
                       <a:off x="0" y="0"/>
-                      <a:ext cx="3733800" cy="2489200"/>
+                      <a:ext cx="3733800" cy="2100262"/>
                     </a:xfrm>
                     <a:prstGeom prst="rect">
                       <a:avLst/>
@@ -5865,7 +5865,7 @@
       <w:r>
         <w:drawing>
           <wp:inline>
-            <wp:extent cx="3733800" cy="2489200"/>
+            <wp:extent cx="3733800" cy="2100262"/>
             <wp:effectExtent b="0" l="0" r="0" t="0"/>
             <wp:docPr descr="CSV-файл полной динамики для гетерогенного случая" title="" id="164" name="Picture"/>
             <a:graphic>
@@ -5886,7 +5886,7 @@
                   <pic:spPr bwMode="auto">
                     <a:xfrm>
                       <a:off x="0" y="0"/>
-                      <a:ext cx="3733800" cy="2489200"/>
+                      <a:ext cx="3733800" cy="2100262"/>
                     </a:xfrm>
                     <a:prstGeom prst="rect">
                       <a:avLst/>
@@ -5922,7 +5922,7 @@
       <w:r>
         <w:drawing>
           <wp:inline>
-            <wp:extent cx="3733800" cy="2489200"/>
+            <wp:extent cx="3733800" cy="2100262"/>
             <wp:effectExtent b="0" l="0" r="0" t="0"/>
             <wp:docPr descr="Сводная таблица по гетерогенности городов" title="" id="168" name="Picture"/>
             <a:graphic>
@@ -5943,7 +5943,7 @@
                   <pic:spPr bwMode="auto">
                     <a:xfrm>
                       <a:off x="0" y="0"/>
-                      <a:ext cx="3733800" cy="2489200"/>
+                      <a:ext cx="3733800" cy="2100262"/>
                     </a:xfrm>
                     <a:prstGeom prst="rect">
                       <a:avLst/>
@@ -6171,7 +6171,7 @@
       <w:r>
         <w:drawing>
           <wp:inline>
-            <wp:extent cx="3733800" cy="2489200"/>
+            <wp:extent cx="3733800" cy="2100262"/>
             <wp:effectExtent b="0" l="0" r="0" t="0"/>
             <wp:docPr descr="Генерация clean-версии гетерогенного скрипта" title="" id="172" name="Picture"/>
             <a:graphic>
@@ -6192,7 +6192,7 @@
                   <pic:spPr bwMode="auto">
                     <a:xfrm>
                       <a:off x="0" y="0"/>
-                      <a:ext cx="3733800" cy="2489200"/>
+                      <a:ext cx="3733800" cy="2100262"/>
                     </a:xfrm>
                     <a:prstGeom prst="rect">
                       <a:avLst/>
@@ -6228,7 +6228,7 @@
       <w:r>
         <w:drawing>
           <wp:inline>
-            <wp:extent cx="3733800" cy="2489200"/>
+            <wp:extent cx="3733800" cy="2100262"/>
             <wp:effectExtent b="0" l="0" r="0" t="0"/>
             <wp:docPr descr="Literate-версия скрипта гетерогенности" title="" id="176" name="Picture"/>
             <a:graphic>
@@ -6249,7 +6249,7 @@
                   <pic:spPr bwMode="auto">
                     <a:xfrm>
                       <a:off x="0" y="0"/>
-                      <a:ext cx="3733800" cy="2489200"/>
+                      <a:ext cx="3733800" cy="2100262"/>
                     </a:xfrm>
                     <a:prstGeom prst="rect">
                       <a:avLst/>
@@ -6285,7 +6285,7 @@
       <w:r>
         <w:drawing>
           <wp:inline>
-            <wp:extent cx="3733800" cy="2489200"/>
+            <wp:extent cx="3733800" cy="2100262"/>
             <wp:effectExtent b="0" l="0" r="0" t="0"/>
             <wp:docPr descr="Jupyter notebook для гетерогенного сценария" title="" id="180" name="Picture"/>
             <a:graphic>
@@ -6306,7 +6306,7 @@
                   <pic:spPr bwMode="auto">
                     <a:xfrm>
                       <a:off x="0" y="0"/>
-                      <a:ext cx="3733800" cy="2489200"/>
+                      <a:ext cx="3733800" cy="2100262"/>
                     </a:xfrm>
                     <a:prstGeom prst="rect">
                       <a:avLst/>
@@ -6419,7 +6419,7 @@
       <w:r>
         <w:drawing>
           <wp:inline>
-            <wp:extent cx="3733800" cy="2489200"/>
+            <wp:extent cx="3733800" cy="2100262"/>
             <wp:effectExtent b="0" l="0" r="0" t="0"/>
             <wp:docPr descr="Запуск скрипта сценария с карантином" title="" id="186" name="Picture"/>
             <a:graphic>
@@ -6440,7 +6440,7 @@
                   <pic:spPr bwMode="auto">
                     <a:xfrm>
                       <a:off x="0" y="0"/>
-                      <a:ext cx="3733800" cy="2489200"/>
+                      <a:ext cx="3733800" cy="2100262"/>
                     </a:xfrm>
                     <a:prstGeom prst="rect">
                       <a:avLst/>
@@ -6496,7 +6496,7 @@
       <w:r>
         <w:drawing>
           <wp:inline>
-            <wp:extent cx="3733800" cy="2489200"/>
+            <wp:extent cx="3733800" cy="2100262"/>
             <wp:effectExtent b="0" l="0" r="0" t="0"/>
             <wp:docPr descr="Сравнение сценариев без карантина и с карантином" title="" id="190" name="Picture"/>
             <a:graphic>
@@ -6517,7 +6517,7 @@
                   <pic:spPr bwMode="auto">
                     <a:xfrm>
                       <a:off x="0" y="0"/>
-                      <a:ext cx="3733800" cy="2489200"/>
+                      <a:ext cx="3733800" cy="2100262"/>
                     </a:xfrm>
                     <a:prstGeom prst="rect">
                       <a:avLst/>
@@ -6591,7 +6591,7 @@
       <w:r>
         <w:drawing>
           <wp:inline>
-            <wp:extent cx="3733800" cy="2489200"/>
+            <wp:extent cx="3733800" cy="2100262"/>
             <wp:effectExtent b="0" l="0" r="0" t="0"/>
             <wp:docPr descr="Базовый сценарий без карантина" title="" id="194" name="Picture"/>
             <a:graphic>
@@ -6612,7 +6612,7 @@
                   <pic:spPr bwMode="auto">
                     <a:xfrm>
                       <a:off x="0" y="0"/>
-                      <a:ext cx="3733800" cy="2489200"/>
+                      <a:ext cx="3733800" cy="2100262"/>
                     </a:xfrm>
                     <a:prstGeom prst="rect">
                       <a:avLst/>
@@ -6648,7 +6648,7 @@
       <w:r>
         <w:drawing>
           <wp:inline>
-            <wp:extent cx="3733800" cy="2489200"/>
+            <wp:extent cx="3733800" cy="2100262"/>
             <wp:effectExtent b="0" l="0" r="0" t="0"/>
             <wp:docPr descr="Сценарий с включённым карантином" title="" id="198" name="Picture"/>
             <a:graphic>
@@ -6669,7 +6669,7 @@
                   <pic:spPr bwMode="auto">
                     <a:xfrm>
                       <a:off x="0" y="0"/>
-                      <a:ext cx="3733800" cy="2489200"/>
+                      <a:ext cx="3733800" cy="2100262"/>
                     </a:xfrm>
                     <a:prstGeom prst="rect">
                       <a:avLst/>
@@ -6705,7 +6705,7 @@
       <w:r>
         <w:drawing>
           <wp:inline>
-            <wp:extent cx="3733800" cy="2489200"/>
+            <wp:extent cx="3733800" cy="2100262"/>
             <wp:effectExtent b="0" l="0" r="0" t="0"/>
             <wp:docPr descr="Сводная таблица по карантинному сценарию" title="" id="202" name="Picture"/>
             <a:graphic>
@@ -6726,7 +6726,7 @@
                   <pic:spPr bwMode="auto">
                     <a:xfrm>
                       <a:off x="0" y="0"/>
-                      <a:ext cx="3733800" cy="2489200"/>
+                      <a:ext cx="3733800" cy="2100262"/>
                     </a:xfrm>
                     <a:prstGeom prst="rect">
                       <a:avLst/>
@@ -6966,7 +6966,7 @@
       <w:r>
         <w:drawing>
           <wp:inline>
-            <wp:extent cx="3733800" cy="2489200"/>
+            <wp:extent cx="3733800" cy="2100262"/>
             <wp:effectExtent b="0" l="0" r="0" t="0"/>
             <wp:docPr descr="Генерация clean-версии карантинного скрипта" title="" id="206" name="Picture"/>
             <a:graphic>
@@ -6987,7 +6987,7 @@
                   <pic:spPr bwMode="auto">
                     <a:xfrm>
                       <a:off x="0" y="0"/>
-                      <a:ext cx="3733800" cy="2489200"/>
+                      <a:ext cx="3733800" cy="2100262"/>
                     </a:xfrm>
                     <a:prstGeom prst="rect">
                       <a:avLst/>
@@ -7023,7 +7023,7 @@
       <w:r>
         <w:drawing>
           <wp:inline>
-            <wp:extent cx="3733800" cy="2489200"/>
+            <wp:extent cx="3733800" cy="2100262"/>
             <wp:effectExtent b="0" l="0" r="0" t="0"/>
             <wp:docPr descr="Jupyter notebook карантинного сценария" title="" id="210" name="Picture"/>
             <a:graphic>
@@ -7044,7 +7044,7 @@
                   <pic:spPr bwMode="auto">
                     <a:xfrm>
                       <a:off x="0" y="0"/>
-                      <a:ext cx="3733800" cy="2489200"/>
+                      <a:ext cx="3733800" cy="2100262"/>
                     </a:xfrm>
                     <a:prstGeom prst="rect">
                       <a:avLst/>
@@ -7080,7 +7080,7 @@
       <w:r>
         <w:drawing>
           <wp:inline>
-            <wp:extent cx="3733800" cy="2489200"/>
+            <wp:extent cx="3733800" cy="2100262"/>
             <wp:effectExtent b="0" l="0" r="0" t="0"/>
             <wp:docPr descr="Markdown-документация карантинного сценария" title="" id="214" name="Picture"/>
             <a:graphic>
@@ -7101,7 +7101,7 @@
                   <pic:spPr bwMode="auto">
                     <a:xfrm>
                       <a:off x="0" y="0"/>
-                      <a:ext cx="3733800" cy="2489200"/>
+                      <a:ext cx="3733800" cy="2100262"/>
                     </a:xfrm>
                     <a:prstGeom prst="rect">
                       <a:avLst/>
@@ -7188,7 +7188,7 @@
       <w:r>
         <w:drawing>
           <wp:inline>
-            <wp:extent cx="3733800" cy="2489200"/>
+            <wp:extent cx="3733800" cy="2100262"/>
             <wp:effectExtent b="0" l="0" r="0" t="0"/>
             <wp:docPr descr="Запуск ограниченной оптимизации" title="" id="219" name="Picture"/>
             <a:graphic>
@@ -7209,7 +7209,7 @@
                   <pic:spPr bwMode="auto">
                     <a:xfrm>
                       <a:off x="0" y="0"/>
-                      <a:ext cx="3733800" cy="2489200"/>
+                      <a:ext cx="3733800" cy="2100262"/>
                     </a:xfrm>
                     <a:prstGeom prst="rect">
                       <a:avLst/>
@@ -7283,7 +7283,7 @@
       <w:r>
         <w:drawing>
           <wp:inline>
-            <wp:extent cx="3733800" cy="2489200"/>
+            <wp:extent cx="3733800" cy="2100262"/>
             <wp:effectExtent b="0" l="0" r="0" t="0"/>
             <wp:docPr descr="Генерация clean-версии ограниченной оптимизации" title="" id="223" name="Picture"/>
             <a:graphic>
@@ -7304,7 +7304,7 @@
                   <pic:spPr bwMode="auto">
                     <a:xfrm>
                       <a:off x="0" y="0"/>
-                      <a:ext cx="3733800" cy="2489200"/>
+                      <a:ext cx="3733800" cy="2100262"/>
                     </a:xfrm>
                     <a:prstGeom prst="rect">
                       <a:avLst/>
@@ -7340,7 +7340,7 @@
       <w:r>
         <w:drawing>
           <wp:inline>
-            <wp:extent cx="3733800" cy="2489200"/>
+            <wp:extent cx="3733800" cy="2100262"/>
             <wp:effectExtent b="0" l="0" r="0" t="0"/>
             <wp:docPr descr="Markdown-документация ограниченной оптимизации" title="" id="227" name="Picture"/>
             <a:graphic>
@@ -7361,7 +7361,7 @@
                   <pic:spPr bwMode="auto">
                     <a:xfrm>
                       <a:off x="0" y="0"/>
-                      <a:ext cx="3733800" cy="2489200"/>
+                      <a:ext cx="3733800" cy="2100262"/>
                     </a:xfrm>
                     <a:prstGeom prst="rect">
                       <a:avLst/>
@@ -7397,7 +7397,7 @@
       <w:r>
         <w:drawing>
           <wp:inline>
-            <wp:extent cx="3733800" cy="2489200"/>
+            <wp:extent cx="3733800" cy="2100262"/>
             <wp:effectExtent b="0" l="0" r="0" t="0"/>
             <wp:docPr descr="Jupyter notebook ограниченной оптимизации" title="" id="231" name="Picture"/>
             <a:graphic>
@@ -7418,7 +7418,7 @@
                   <pic:spPr bwMode="auto">
                     <a:xfrm>
                       <a:off x="0" y="0"/>
-                      <a:ext cx="3733800" cy="2489200"/>
+                      <a:ext cx="3733800" cy="2100262"/>
                     </a:xfrm>
                     <a:prstGeom prst="rect">
                       <a:avLst/>
@@ -7540,7 +7540,7 @@
       <w:r>
         <w:drawing>
           <wp:inline>
-            <wp:extent cx="3733800" cy="2489200"/>
+            <wp:extent cx="3733800" cy="2100262"/>
             <wp:effectExtent b="0" l="0" r="0" t="0"/>
             <wp:docPr descr="CSV-файл с результатами оптимизации при ограничении на пик" title="" id="235" name="Picture"/>
             <a:graphic>
@@ -7561,7 +7561,7 @@
                   <pic:spPr bwMode="auto">
                     <a:xfrm>
                       <a:off x="0" y="0"/>
-                      <a:ext cx="3733800" cy="2489200"/>
+                      <a:ext cx="3733800" cy="2100262"/>
                     </a:xfrm>
                     <a:prstGeom prst="rect">
                       <a:avLst/>

</xml_diff>

<commit_message>
report(lab04): rewrite detailed report and generate text-first pdf
</commit_message>
<xml_diff>
--- a/labs/lab04/release/simulation-modeling--lab04--report.docx
+++ b/labs/lab04/release/simulation-modeling--lab04--report.docx
@@ -15,16 +15,16 @@
         <w:pStyle w:val="Subtitle"/>
       </w:pPr>
       <w:r>
-        <w:t xml:space="preserve">Лабораторная работа №4. Реализация SIR-модели в агентном подходе</w:t>
-      </w:r>
-    </w:p>
-    <w:bookmarkStart w:id="15" w:name="общая-информация"/>
+        <w:t xml:space="preserve">Лабораторная работа №4. Агентная реализация SIR-модели и анализ сценариев</w:t>
+      </w:r>
+    </w:p>
+    <w:bookmarkStart w:id="15" w:name="общие-сведения"/>
     <w:p>
       <w:pPr>
         <w:pStyle w:val="Heading1"/>
       </w:pPr>
       <w:r>
-        <w:t xml:space="preserve">Общая информация</w:t>
+        <w:t xml:space="preserve">Общие сведения</w:t>
       </w:r>
     </w:p>
     <w:bookmarkStart w:id="9" w:name="данные-студента"/>
@@ -103,13 +103,13 @@
       </w:r>
     </w:p>
     <w:bookmarkEnd w:id="9"/>
-    <w:bookmarkStart w:id="14" w:name="ссылки-на-репозиторий-и-релизы"/>
+    <w:bookmarkStart w:id="14" w:name="репозитории-и-релизы"/>
     <w:p>
       <w:pPr>
         <w:pStyle w:val="Heading2"/>
       </w:pPr>
       <w:r>
-        <w:t xml:space="preserve">Ссылки на репозиторий и релизы</w:t>
+        <w:t xml:space="preserve">Репозитории и релизы</w:t>
       </w:r>
     </w:p>
     <w:p>
@@ -206,22 +206,22 @@
     </w:p>
     <w:bookmarkEnd w:id="14"/>
     <w:bookmarkEnd w:id="15"/>
-    <w:bookmarkStart w:id="19" w:name="цель-задачи-и-инструменты"/>
+    <w:bookmarkStart w:id="18" w:name="цель-и-задачи-работы"/>
     <w:p>
       <w:pPr>
         <w:pStyle w:val="Heading1"/>
       </w:pPr>
       <w:r>
-        <w:t xml:space="preserve">Цель, задачи и инструменты</w:t>
-      </w:r>
-    </w:p>
-    <w:bookmarkStart w:id="16" w:name="цель-работы"/>
+        <w:t xml:space="preserve">Цель и задачи работы</w:t>
+      </w:r>
+    </w:p>
+    <w:bookmarkStart w:id="16" w:name="цель"/>
     <w:p>
       <w:pPr>
         <w:pStyle w:val="Heading2"/>
       </w:pPr>
       <w:r>
-        <w:t xml:space="preserve">Цель работы</w:t>
+        <w:t xml:space="preserve">Цель</w:t>
       </w:r>
     </w:p>
     <w:p>
@@ -229,7 +229,7 @@
         <w:pStyle w:val="FirstParagraph"/>
       </w:pPr>
       <w:r>
-        <w:t xml:space="preserve">Разработать и исследовать агентную эпидемиологическую модель SIR, провести серию вычислительных экспериментов, проанализировать влияние ключевых параметров и подготовить воспроизводимый комплект материалов лабораторной работы.</w:t>
+        <w:t xml:space="preserve">Разработать агентную имитационную модель распространения инфекции типа SIR, провести серию вычислительных экспериментов и оценить влияние управляемых факторов (миграция, карантин, неоднородность популяции, подбор параметров) на эпидемическую динамику.</w:t>
       </w:r>
     </w:p>
     <w:bookmarkEnd w:id="16"/>
@@ -251,7 +251,7 @@
         </w:numPr>
       </w:pPr>
       <w:r>
-        <w:t xml:space="preserve">Подготовить проект на базе</w:t>
+        <w:t xml:space="preserve">Подготовить воспроизводимую структуру проекта на базе</w:t>
       </w:r>
       <w:r>
         <w:t xml:space="preserve"> </w:t>
@@ -275,7 +275,7 @@
         </w:numPr>
       </w:pPr>
       <w:r>
-        <w:t xml:space="preserve">Реализовать SIR-модель в агентном подходе (</w:t>
+        <w:t xml:space="preserve">Реализовать базовый сценарий SIR-модели в агентной постановке (</w:t>
       </w:r>
       <w:r>
         <w:rPr>
@@ -296,7 +296,7 @@
         </w:numPr>
       </w:pPr>
       <w:r>
-        <w:t xml:space="preserve">Провести базовый и расширенные эксперименты.</w:t>
+        <w:t xml:space="preserve">Провести параметрические эксперименты и собрать результаты в табличном виде.</w:t>
       </w:r>
     </w:p>
     <w:p>
@@ -308,7 +308,7 @@
         </w:numPr>
       </w:pPr>
       <w:r>
-        <w:t xml:space="preserve">Выполнить дополнительные задания (порог, миграция, гетерогенность, карантин, оптимизация).</w:t>
+        <w:t xml:space="preserve">Исследовать дополнительные сценарии: порог эпидемии, миграцию, гетерогенность, карантин, оптимизацию.</w:t>
       </w:r>
     </w:p>
     <w:p>
@@ -320,17 +320,35 @@
         </w:numPr>
       </w:pPr>
       <w:r>
-        <w:t xml:space="preserve">Подготовить отчёт, презентацию и релизные файлы.</w:t>
+        <w:t xml:space="preserve">Сформировать отчёт, презентацию и релизные артефакты.</w:t>
       </w:r>
     </w:p>
     <w:bookmarkEnd w:id="17"/>
-    <w:bookmarkStart w:id="18" w:name="стек"/>
+    <w:bookmarkEnd w:id="18"/>
+    <w:bookmarkStart w:id="21" w:name="теоретическая-часть"/>
+    <w:p>
+      <w:pPr>
+        <w:pStyle w:val="Heading1"/>
+      </w:pPr>
+      <w:r>
+        <w:t xml:space="preserve">Теоретическая часть</w:t>
+      </w:r>
+    </w:p>
+    <w:bookmarkStart w:id="19" w:name="классическая-модель-sir"/>
     <w:p>
       <w:pPr>
         <w:pStyle w:val="Heading2"/>
       </w:pPr>
       <w:r>
-        <w:t xml:space="preserve">Стек</w:t>
+        <w:t xml:space="preserve">Классическая модель SIR</w:t>
+      </w:r>
+    </w:p>
+    <w:p>
+      <w:pPr>
+        <w:pStyle w:val="FirstParagraph"/>
+      </w:pPr>
+      <w:r>
+        <w:t xml:space="preserve">Популяция разбивается на три группы:</w:t>
       </w:r>
     </w:p>
     <w:p>
@@ -341,11 +359,31 @@
           <w:numId w:val="1004"/>
         </w:numPr>
       </w:pPr>
-      <w:r>
-        <w:rPr>
-          <w:rStyle w:val="VerbatimChar"/>
-        </w:rPr>
-        <w:t xml:space="preserve">Julia</w:t>
+      <m:oMath>
+        <m:r>
+          <m:t>S</m:t>
+        </m:r>
+        <m:r>
+          <m:rPr>
+            <m:sty m:val="p"/>
+          </m:rPr>
+          <m:t>(</m:t>
+        </m:r>
+        <m:r>
+          <m:t>t</m:t>
+        </m:r>
+        <m:r>
+          <m:rPr>
+            <m:sty m:val="p"/>
+          </m:rPr>
+          <m:t>)</m:t>
+        </m:r>
+      </m:oMath>
+      <w:r>
+        <w:t xml:space="preserve"> </w:t>
+      </w:r>
+      <w:r>
+        <w:t xml:space="preserve">— восприимчивые;</w:t>
       </w:r>
     </w:p>
     <w:p>
@@ -356,11 +394,31 @@
           <w:numId w:val="1004"/>
         </w:numPr>
       </w:pPr>
-      <w:r>
-        <w:rPr>
-          <w:rStyle w:val="VerbatimChar"/>
-        </w:rPr>
-        <w:t xml:space="preserve">Agents.jl</w:t>
+      <m:oMath>
+        <m:r>
+          <m:t>I</m:t>
+        </m:r>
+        <m:r>
+          <m:rPr>
+            <m:sty m:val="p"/>
+          </m:rPr>
+          <m:t>(</m:t>
+        </m:r>
+        <m:r>
+          <m:t>t</m:t>
+        </m:r>
+        <m:r>
+          <m:rPr>
+            <m:sty m:val="p"/>
+          </m:rPr>
+          <m:t>)</m:t>
+        </m:r>
+      </m:oMath>
+      <w:r>
+        <w:t xml:space="preserve"> </w:t>
+      </w:r>
+      <w:r>
+        <w:t xml:space="preserve">— инфицированные;</w:t>
       </w:r>
     </w:p>
     <w:p>
@@ -371,150 +429,276 @@
           <w:numId w:val="1004"/>
         </w:numPr>
       </w:pPr>
-      <w:r>
-        <w:rPr>
-          <w:rStyle w:val="VerbatimChar"/>
-        </w:rPr>
-        <w:t xml:space="preserve">DrWatson</w:t>
-      </w:r>
-    </w:p>
-    <w:p>
-      <w:pPr>
-        <w:pStyle w:val="Compact"/>
-        <w:numPr>
-          <w:ilvl w:val="0"/>
-          <w:numId w:val="1004"/>
-        </w:numPr>
-      </w:pPr>
-      <w:r>
-        <w:rPr>
-          <w:rStyle w:val="VerbatimChar"/>
-        </w:rPr>
-        <w:t xml:space="preserve">Literate.jl</w:t>
-      </w:r>
-    </w:p>
-    <w:p>
-      <w:pPr>
-        <w:pStyle w:val="Compact"/>
-        <w:numPr>
-          <w:ilvl w:val="0"/>
-          <w:numId w:val="1004"/>
-        </w:numPr>
-      </w:pPr>
-      <w:r>
-        <w:rPr>
-          <w:rStyle w:val="VerbatimChar"/>
-        </w:rPr>
-        <w:t xml:space="preserve">BlackBoxOptim</w:t>
-      </w:r>
-    </w:p>
-    <w:bookmarkEnd w:id="18"/>
+      <m:oMath>
+        <m:r>
+          <m:t>R</m:t>
+        </m:r>
+        <m:r>
+          <m:rPr>
+            <m:sty m:val="p"/>
+          </m:rPr>
+          <m:t>(</m:t>
+        </m:r>
+        <m:r>
+          <m:t>t</m:t>
+        </m:r>
+        <m:r>
+          <m:rPr>
+            <m:sty m:val="p"/>
+          </m:rPr>
+          <m:t>)</m:t>
+        </m:r>
+      </m:oMath>
+      <w:r>
+        <w:t xml:space="preserve"> </w:t>
+      </w:r>
+      <w:r>
+        <w:t xml:space="preserve">— выздоровевшие (или удалённые из процесса передачи).</w:t>
+      </w:r>
+    </w:p>
+    <w:p>
+      <w:pPr>
+        <w:pStyle w:val="FirstParagraph"/>
+      </w:pPr>
+      <w:r>
+        <w:t xml:space="preserve">В непрерывной форме базовая динамика описывается системой:</w:t>
+      </w:r>
+    </w:p>
+    <w:p>
+      <w:pPr>
+        <w:pStyle w:val="BodyText"/>
+      </w:pPr>
+      <m:oMathPara>
+        <m:oMathParaPr>
+          <m:jc m:val="center"/>
+        </m:oMathParaPr>
+        <m:oMath>
+          <m:f>
+            <m:fPr>
+              <m:type m:val="bar"/>
+            </m:fPr>
+            <m:num>
+              <m:r>
+                <m:t>d</m:t>
+              </m:r>
+              <m:r>
+                <m:t>S</m:t>
+              </m:r>
+            </m:num>
+            <m:den>
+              <m:r>
+                <m:t>d</m:t>
+              </m:r>
+              <m:r>
+                <m:t>t</m:t>
+              </m:r>
+            </m:den>
+          </m:f>
+          <m:r>
+            <m:rPr>
+              <m:sty m:val="p"/>
+            </m:rPr>
+            <m:t>=</m:t>
+          </m:r>
+          <m:r>
+            <m:rPr>
+              <m:sty m:val="p"/>
+            </m:rPr>
+            <m:t>−</m:t>
+          </m:r>
+          <m:r>
+            <m:t>β</m:t>
+          </m:r>
+          <m:f>
+            <m:fPr>
+              <m:type m:val="bar"/>
+            </m:fPr>
+            <m:num>
+              <m:r>
+                <m:t>S</m:t>
+              </m:r>
+              <m:r>
+                <m:t>I</m:t>
+              </m:r>
+            </m:num>
+            <m:den>
+              <m:r>
+                <m:t>N</m:t>
+              </m:r>
+            </m:den>
+          </m:f>
+          <m:r>
+            <m:rPr>
+              <m:sty m:val="p"/>
+            </m:rPr>
+            <m:t>,</m:t>
+          </m:r>
+          <m:r>
+            <m:t> </m:t>
+          </m:r>
+          <m:f>
+            <m:fPr>
+              <m:type m:val="bar"/>
+            </m:fPr>
+            <m:num>
+              <m:r>
+                <m:t>d</m:t>
+              </m:r>
+              <m:r>
+                <m:t>I</m:t>
+              </m:r>
+            </m:num>
+            <m:den>
+              <m:r>
+                <m:t>d</m:t>
+              </m:r>
+              <m:r>
+                <m:t>t</m:t>
+              </m:r>
+            </m:den>
+          </m:f>
+          <m:r>
+            <m:rPr>
+              <m:sty m:val="p"/>
+            </m:rPr>
+            <m:t>=</m:t>
+          </m:r>
+          <m:r>
+            <m:t>β</m:t>
+          </m:r>
+          <m:f>
+            <m:fPr>
+              <m:type m:val="bar"/>
+            </m:fPr>
+            <m:num>
+              <m:r>
+                <m:t>S</m:t>
+              </m:r>
+              <m:r>
+                <m:t>I</m:t>
+              </m:r>
+            </m:num>
+            <m:den>
+              <m:r>
+                <m:t>N</m:t>
+              </m:r>
+            </m:den>
+          </m:f>
+          <m:r>
+            <m:rPr>
+              <m:sty m:val="p"/>
+            </m:rPr>
+            <m:t>−</m:t>
+          </m:r>
+          <m:r>
+            <m:t>γ</m:t>
+          </m:r>
+          <m:r>
+            <m:t>I</m:t>
+          </m:r>
+          <m:r>
+            <m:rPr>
+              <m:sty m:val="p"/>
+            </m:rPr>
+            <m:t>,</m:t>
+          </m:r>
+          <m:r>
+            <m:t> </m:t>
+          </m:r>
+          <m:f>
+            <m:fPr>
+              <m:type m:val="bar"/>
+            </m:fPr>
+            <m:num>
+              <m:r>
+                <m:t>d</m:t>
+              </m:r>
+              <m:r>
+                <m:t>R</m:t>
+              </m:r>
+            </m:num>
+            <m:den>
+              <m:r>
+                <m:t>d</m:t>
+              </m:r>
+              <m:r>
+                <m:t>t</m:t>
+              </m:r>
+            </m:den>
+          </m:f>
+          <m:r>
+            <m:rPr>
+              <m:sty m:val="p"/>
+            </m:rPr>
+            <m:t>=</m:t>
+          </m:r>
+          <m:r>
+            <m:t>γ</m:t>
+          </m:r>
+          <m:r>
+            <m:t>I</m:t>
+          </m:r>
+          <m:r>
+            <m:rPr>
+              <m:sty m:val="p"/>
+            </m:rPr>
+            <m:t>,</m:t>
+          </m:r>
+        </m:oMath>
+      </m:oMathPara>
+    </w:p>
+    <w:p>
+      <w:pPr>
+        <w:pStyle w:val="FirstParagraph"/>
+      </w:pPr>
+      <w:r>
+        <w:t xml:space="preserve">где</w:t>
+      </w:r>
+      <w:r>
+        <w:t xml:space="preserve"> </w:t>
+      </w:r>
+      <m:oMath>
+        <m:r>
+          <m:t>β</m:t>
+        </m:r>
+      </m:oMath>
+      <w:r>
+        <w:t xml:space="preserve"> </w:t>
+      </w:r>
+      <w:r>
+        <w:t xml:space="preserve">— интенсивность передачи,</w:t>
+      </w:r>
+      <w:r>
+        <w:t xml:space="preserve"> </w:t>
+      </w:r>
+      <m:oMath>
+        <m:r>
+          <m:t>γ</m:t>
+        </m:r>
+      </m:oMath>
+      <w:r>
+        <w:t xml:space="preserve"> </w:t>
+      </w:r>
+      <w:r>
+        <w:t xml:space="preserve">— интенсивность выздоровления.</w:t>
+      </w:r>
+    </w:p>
+    <w:p>
+      <w:pPr>
+        <w:pStyle w:val="BodyText"/>
+      </w:pPr>
+      <w:r>
+        <w:t xml:space="preserve">В агентной модели эти соотношения реализуются как локальные правила переходов между состояниями отдельных агентов, что позволяет естественно учитывать пространственные и организационные ограничения (города, карантин, мобильность).</w:t>
+      </w:r>
+    </w:p>
     <w:bookmarkEnd w:id="19"/>
-    <w:bookmarkStart w:id="22" w:name="теоретические-положения"/>
-    <w:p>
-      <w:pPr>
-        <w:pStyle w:val="Heading1"/>
-      </w:pPr>
-      <w:r>
-        <w:t xml:space="preserve">Теоретические положения</w:t>
-      </w:r>
-    </w:p>
-    <w:bookmarkStart w:id="20" w:name="sir-модель"/>
+    <w:bookmarkStart w:id="20" w:name="базовые-параметры-моделирования"/>
     <w:p>
       <w:pPr>
         <w:pStyle w:val="Heading2"/>
       </w:pPr>
       <w:r>
-        <w:t xml:space="preserve">SIR-модель</w:t>
-      </w:r>
-    </w:p>
-    <w:p>
-      <w:pPr>
-        <w:pStyle w:val="FirstParagraph"/>
-      </w:pPr>
-      <w:r>
-        <w:t xml:space="preserve">Классическая SIR-модель использует три состояния популяции:</w:t>
-      </w:r>
-    </w:p>
-    <w:p>
-      <w:pPr>
-        <w:pStyle w:val="Compact"/>
-        <w:numPr>
-          <w:ilvl w:val="0"/>
-          <w:numId w:val="1005"/>
-        </w:numPr>
-      </w:pPr>
-      <w:r>
-        <w:rPr>
-          <w:rStyle w:val="VerbatimChar"/>
-        </w:rPr>
-        <w:t xml:space="preserve">S</w:t>
-      </w:r>
-      <w:r>
-        <w:t xml:space="preserve"> </w:t>
-      </w:r>
-      <w:r>
-        <w:t xml:space="preserve">— восприимчивые;</w:t>
-      </w:r>
-    </w:p>
-    <w:p>
-      <w:pPr>
-        <w:pStyle w:val="Compact"/>
-        <w:numPr>
-          <w:ilvl w:val="0"/>
-          <w:numId w:val="1005"/>
-        </w:numPr>
-      </w:pPr>
-      <w:r>
-        <w:rPr>
-          <w:rStyle w:val="VerbatimChar"/>
-        </w:rPr>
-        <w:t xml:space="preserve">I</w:t>
-      </w:r>
-      <w:r>
-        <w:t xml:space="preserve"> </w:t>
-      </w:r>
-      <w:r>
-        <w:t xml:space="preserve">— инфицированные;</w:t>
-      </w:r>
-    </w:p>
-    <w:p>
-      <w:pPr>
-        <w:pStyle w:val="Compact"/>
-        <w:numPr>
-          <w:ilvl w:val="0"/>
-          <w:numId w:val="1005"/>
-        </w:numPr>
-      </w:pPr>
-      <w:r>
-        <w:rPr>
-          <w:rStyle w:val="VerbatimChar"/>
-        </w:rPr>
-        <w:t xml:space="preserve">R</w:t>
-      </w:r>
-      <w:r>
-        <w:t xml:space="preserve"> </w:t>
-      </w:r>
-      <w:r>
-        <w:t xml:space="preserve">— выздоровевшие.</w:t>
-      </w:r>
-    </w:p>
-    <w:p>
-      <w:pPr>
-        <w:pStyle w:val="FirstParagraph"/>
-      </w:pPr>
-      <w:r>
-        <w:t xml:space="preserve">В агентном подходе каждый человек моделируется отдельным агентом, что позволяет добавлять локальные правила (миграцию, карантин, неоднородность параметров).</w:t>
-      </w:r>
-    </w:p>
-    <w:bookmarkEnd w:id="20"/>
-    <w:bookmarkStart w:id="21" w:name="базовые-параметры-эксперимента"/>
-    <w:p>
-      <w:pPr>
-        <w:pStyle w:val="Heading2"/>
-      </w:pPr>
-      <w:r>
-        <w:t xml:space="preserve">Базовые параметры эксперимента</w:t>
+        <w:t xml:space="preserve">Базовые параметры моделирования</w:t>
       </w:r>
     </w:p>
     <w:tbl>
@@ -562,10 +746,16 @@
               <w:pStyle w:val="Compact"/>
             </w:pPr>
             <w:r>
+              <w:t xml:space="preserve">Размеры подгрупп (</w:t>
+            </w:r>
+            <w:r>
               <w:rPr>
                 <w:rStyle w:val="VerbatimChar"/>
               </w:rPr>
               <w:t xml:space="preserve">Ns</w:t>
+            </w:r>
+            <w:r>
+              <w:t xml:space="preserve">)</w:t>
             </w:r>
           </w:p>
         </w:tc>
@@ -592,10 +782,16 @@
               <w:pStyle w:val="Compact"/>
             </w:pPr>
             <w:r>
+              <w:t xml:space="preserve">Базовая заразность (</w:t>
+            </w:r>
+            <w:r>
               <w:rPr>
                 <w:rStyle w:val="VerbatimChar"/>
               </w:rPr>
               <w:t xml:space="preserve">beta_und</w:t>
+            </w:r>
+            <w:r>
+              <w:t xml:space="preserve">)</w:t>
             </w:r>
           </w:p>
         </w:tc>
@@ -622,10 +818,16 @@
               <w:pStyle w:val="Compact"/>
             </w:pPr>
             <w:r>
+              <w:t xml:space="preserve">Детектированная заразность (</w:t>
+            </w:r>
+            <w:r>
               <w:rPr>
                 <w:rStyle w:val="VerbatimChar"/>
               </w:rPr>
               <w:t xml:space="preserve">beta_det</w:t>
+            </w:r>
+            <w:r>
+              <w:t xml:space="preserve">)</w:t>
             </w:r>
           </w:p>
         </w:tc>
@@ -652,10 +854,16 @@
               <w:pStyle w:val="Compact"/>
             </w:pPr>
             <w:r>
+              <w:t xml:space="preserve">Период инфекционности (</w:t>
+            </w:r>
+            <w:r>
               <w:rPr>
                 <w:rStyle w:val="VerbatimChar"/>
               </w:rPr>
               <w:t xml:space="preserve">infection_period</w:t>
+            </w:r>
+            <w:r>
+              <w:t xml:space="preserve">)</w:t>
             </w:r>
           </w:p>
         </w:tc>
@@ -682,10 +890,16 @@
               <w:pStyle w:val="Compact"/>
             </w:pPr>
             <w:r>
+              <w:t xml:space="preserve">Время выявления (</w:t>
+            </w:r>
+            <w:r>
               <w:rPr>
                 <w:rStyle w:val="VerbatimChar"/>
               </w:rPr>
               <w:t xml:space="preserve">detection_time</w:t>
+            </w:r>
+            <w:r>
+              <w:t xml:space="preserve">)</w:t>
             </w:r>
           </w:p>
         </w:tc>
@@ -712,10 +926,16 @@
               <w:pStyle w:val="Compact"/>
             </w:pPr>
             <w:r>
+              <w:t xml:space="preserve">Летальность (</w:t>
+            </w:r>
+            <w:r>
               <w:rPr>
                 <w:rStyle w:val="VerbatimChar"/>
               </w:rPr>
               <w:t xml:space="preserve">death_rate</w:t>
+            </w:r>
+            <w:r>
+              <w:t xml:space="preserve">)</w:t>
             </w:r>
           </w:p>
         </w:tc>
@@ -742,10 +962,16 @@
               <w:pStyle w:val="Compact"/>
             </w:pPr>
             <w:r>
+              <w:t xml:space="preserve">Вероятность повторного заражения (</w:t>
+            </w:r>
+            <w:r>
               <w:rPr>
                 <w:rStyle w:val="VerbatimChar"/>
               </w:rPr>
               <w:t xml:space="preserve">reinfection_probability</w:t>
+            </w:r>
+            <w:r>
+              <w:t xml:space="preserve">)</w:t>
             </w:r>
           </w:p>
         </w:tc>
@@ -765,29 +991,182 @@
         </w:tc>
       </w:tr>
     </w:tbl>
+    <w:bookmarkEnd w:id="20"/>
     <w:bookmarkEnd w:id="21"/>
+    <w:bookmarkStart w:id="36" w:name="инструментальная-часть"/>
+    <w:p>
+      <w:pPr>
+        <w:pStyle w:val="Heading1"/>
+      </w:pPr>
+      <w:r>
+        <w:t xml:space="preserve">Инструментальная часть</w:t>
+      </w:r>
+    </w:p>
+    <w:bookmarkStart w:id="22" w:name="программный-стек"/>
+    <w:p>
+      <w:pPr>
+        <w:pStyle w:val="Heading2"/>
+      </w:pPr>
+      <w:r>
+        <w:t xml:space="preserve">Программный стек</w:t>
+      </w:r>
+    </w:p>
+    <w:p>
+      <w:pPr>
+        <w:pStyle w:val="Compact"/>
+        <w:numPr>
+          <w:ilvl w:val="0"/>
+          <w:numId w:val="1005"/>
+        </w:numPr>
+      </w:pPr>
+      <w:r>
+        <w:rPr>
+          <w:rStyle w:val="VerbatimChar"/>
+        </w:rPr>
+        <w:t xml:space="preserve">Julia</w:t>
+      </w:r>
+      <w:r>
+        <w:t xml:space="preserve"> </w:t>
+      </w:r>
+      <w:r>
+        <w:t xml:space="preserve">— язык реализации модели;</w:t>
+      </w:r>
+    </w:p>
+    <w:p>
+      <w:pPr>
+        <w:pStyle w:val="Compact"/>
+        <w:numPr>
+          <w:ilvl w:val="0"/>
+          <w:numId w:val="1005"/>
+        </w:numPr>
+      </w:pPr>
+      <w:r>
+        <w:rPr>
+          <w:rStyle w:val="VerbatimChar"/>
+        </w:rPr>
+        <w:t xml:space="preserve">Agents.jl</w:t>
+      </w:r>
+      <w:r>
+        <w:t xml:space="preserve"> </w:t>
+      </w:r>
+      <w:r>
+        <w:t xml:space="preserve">— агентное моделирование;</w:t>
+      </w:r>
+    </w:p>
+    <w:p>
+      <w:pPr>
+        <w:pStyle w:val="Compact"/>
+        <w:numPr>
+          <w:ilvl w:val="0"/>
+          <w:numId w:val="1005"/>
+        </w:numPr>
+      </w:pPr>
+      <w:r>
+        <w:rPr>
+          <w:rStyle w:val="VerbatimChar"/>
+        </w:rPr>
+        <w:t xml:space="preserve">DrWatson</w:t>
+      </w:r>
+      <w:r>
+        <w:t xml:space="preserve"> </w:t>
+      </w:r>
+      <w:r>
+        <w:t xml:space="preserve">— структура и воспроизводимость проекта;</w:t>
+      </w:r>
+    </w:p>
+    <w:p>
+      <w:pPr>
+        <w:pStyle w:val="Compact"/>
+        <w:numPr>
+          <w:ilvl w:val="0"/>
+          <w:numId w:val="1005"/>
+        </w:numPr>
+      </w:pPr>
+      <w:r>
+        <w:rPr>
+          <w:rStyle w:val="VerbatimChar"/>
+        </w:rPr>
+        <w:t xml:space="preserve">Literate.jl</w:t>
+      </w:r>
+      <w:r>
+        <w:t xml:space="preserve"> </w:t>
+      </w:r>
+      <w:r>
+        <w:t xml:space="preserve">— генерация</w:t>
+      </w:r>
+      <w:r>
+        <w:t xml:space="preserve"> </w:t>
+      </w:r>
+      <w:r>
+        <w:rPr>
+          <w:rStyle w:val="VerbatimChar"/>
+        </w:rPr>
+        <w:t xml:space="preserve">.md</w:t>
+      </w:r>
+      <w:r>
+        <w:t xml:space="preserve"> </w:t>
+      </w:r>
+      <w:r>
+        <w:t xml:space="preserve">и</w:t>
+      </w:r>
+      <w:r>
+        <w:t xml:space="preserve"> </w:t>
+      </w:r>
+      <w:r>
+        <w:rPr>
+          <w:rStyle w:val="VerbatimChar"/>
+        </w:rPr>
+        <w:t xml:space="preserve">.ipynb</w:t>
+      </w:r>
+      <w:r>
+        <w:t xml:space="preserve"> </w:t>
+      </w:r>
+      <w:r>
+        <w:t xml:space="preserve">из исходных сценариев;</w:t>
+      </w:r>
+    </w:p>
+    <w:p>
+      <w:pPr>
+        <w:pStyle w:val="Compact"/>
+        <w:numPr>
+          <w:ilvl w:val="0"/>
+          <w:numId w:val="1005"/>
+        </w:numPr>
+      </w:pPr>
+      <w:r>
+        <w:rPr>
+          <w:rStyle w:val="VerbatimChar"/>
+        </w:rPr>
+        <w:t xml:space="preserve">BlackBoxOptim</w:t>
+      </w:r>
+      <w:r>
+        <w:t xml:space="preserve"> </w:t>
+      </w:r>
+      <w:r>
+        <w:t xml:space="preserve">— оптимизационные эксперименты.</w:t>
+      </w:r>
+    </w:p>
     <w:bookmarkEnd w:id="22"/>
-    <w:bookmarkStart w:id="43" w:name="подготовка-окружения"/>
-    <w:p>
-      <w:pPr>
-        <w:pStyle w:val="Heading1"/>
+    <w:bookmarkStart w:id="35" w:name="подготовка-окружения"/>
+    <w:p>
+      <w:pPr>
+        <w:pStyle w:val="Heading2"/>
       </w:pPr>
       <w:r>
         <w:t xml:space="preserve">Подготовка окружения</w:t>
       </w:r>
     </w:p>
-    <w:bookmarkStart w:id="35" w:name="инициализация-и-активация"/>
-    <w:p>
-      <w:pPr>
-        <w:pStyle w:val="Heading2"/>
-      </w:pPr>
-      <w:r>
-        <w:t xml:space="preserve">Инициализация и активация</w:t>
-      </w:r>
-    </w:p>
     <w:p>
       <w:pPr>
         <w:pStyle w:val="FirstParagraph"/>
+      </w:pPr>
+      <w:r>
+        <w:t xml:space="preserve">Инициализация проекта и подключение зависимостей выполнялись последовательно.</w:t>
+      </w:r>
+    </w:p>
+    <w:p>
+      <w:pPr>
+        <w:pStyle w:val="BodyText"/>
       </w:pPr>
       <w:r>
         <w:drawing>
@@ -799,7 +1178,7 @@
               <a:graphicData uri="http://schemas.openxmlformats.org/drawingml/2006/picture">
                 <pic:pic>
                   <pic:nvPicPr>
-                    <pic:cNvPr descr="image/0julia.png" id="25" name="Picture"/>
+                    <pic:cNvPr descr="image/2init_proj.png" id="25" name="Picture"/>
                     <pic:cNvPicPr>
                       <a:picLocks noChangeArrowheads="1" noChangeAspect="1"/>
                     </pic:cNvPicPr>
@@ -844,7 +1223,7 @@
               <a:graphicData uri="http://schemas.openxmlformats.org/drawingml/2006/picture">
                 <pic:pic>
                   <pic:nvPicPr>
-                    <pic:cNvPr descr="image/1drwatson.png" id="28" name="Picture"/>
+                    <pic:cNvPr descr="image/4pkg_activate.png" id="28" name="Picture"/>
                     <pic:cNvPicPr>
                       <a:picLocks noChangeArrowheads="1" noChangeAspect="1"/>
                     </pic:cNvPicPr>
@@ -891,7 +1270,7 @@
               <a:graphicData uri="http://schemas.openxmlformats.org/drawingml/2006/picture">
                 <pic:pic>
                   <pic:nvPicPr>
-                    <pic:cNvPr descr="image/2init_proj.png" id="31" name="Picture"/>
+                    <pic:cNvPr descr="image/5pkg_add.png" id="31" name="Picture"/>
                     <pic:cNvPicPr>
                       <a:picLocks noChangeArrowheads="1" noChangeAspect="1"/>
                     </pic:cNvPicPr>
@@ -936,7 +1315,7 @@
               <a:graphicData uri="http://schemas.openxmlformats.org/drawingml/2006/picture">
                 <pic:pic>
                   <pic:nvPicPr>
-                    <pic:cNvPr descr="image/4pkg_activate.png" id="34" name="Picture"/>
+                    <pic:cNvPr descr="image/6pkg_finished.png" id="34" name="Picture"/>
                     <pic:cNvPicPr>
                       <a:picLocks noChangeArrowheads="1" noChangeAspect="1"/>
                     </pic:cNvPicPr>
@@ -969,149 +1348,63 @@
         </w:drawing>
       </w:r>
     </w:p>
+    <w:p>
+      <w:pPr>
+        <w:pStyle w:val="BodyText"/>
+      </w:pPr>
+      <w:r>
+        <w:t xml:space="preserve">Результат этапа: сформировано рабочее окружение с фиксируемой структурой каталогов и воспроизводимым набором библиотек.</w:t>
+      </w:r>
+    </w:p>
     <w:bookmarkEnd w:id="35"/>
-    <w:bookmarkStart w:id="42" w:name="установка-зависимостей"/>
+    <w:bookmarkEnd w:id="36"/>
+    <w:bookmarkStart w:id="94" w:name="X24fe8a3a191a6e7b3b6d496f5ba8faef3e6dcee"/>
+    <w:p>
+      <w:pPr>
+        <w:pStyle w:val="Heading1"/>
+      </w:pPr>
+      <w:r>
+        <w:t xml:space="preserve">Ход выполнения и результаты экспериментов</w:t>
+      </w:r>
+    </w:p>
+    <w:bookmarkStart w:id="43" w:name="эксперимент-1.-базовый-запуск-sir"/>
     <w:p>
       <w:pPr>
         <w:pStyle w:val="Heading2"/>
       </w:pPr>
       <w:r>
-        <w:t xml:space="preserve">Установка зависимостей</w:t>
+        <w:t xml:space="preserve">Эксперимент 1. Базовый запуск SIR</w:t>
       </w:r>
     </w:p>
     <w:p>
       <w:pPr>
         <w:pStyle w:val="FirstParagraph"/>
+      </w:pPr>
+      <w:r>
+        <w:t xml:space="preserve">Постановка: выполнить контрольный запуск модели при базовых параметрах и получить опорную траекторию эпидемии.</w:t>
+      </w:r>
+    </w:p>
+    <w:p>
+      <w:pPr>
+        <w:pStyle w:val="BodyText"/>
       </w:pPr>
       <w:r>
         <w:drawing>
           <wp:inline>
-            <wp:extent cx="2560320" cy="1440180"/>
+            <wp:extent cx="2240280" cy="1260157"/>
             <wp:effectExtent b="0" l="0" r="0" t="0"/>
-            <wp:docPr descr="" title="" id="37" name="Picture"/>
+            <wp:docPr descr="" title="" id="38" name="Picture"/>
             <a:graphic>
               <a:graphicData uri="http://schemas.openxmlformats.org/drawingml/2006/picture">
                 <pic:pic>
                   <pic:nvPicPr>
-                    <pic:cNvPr descr="image/5pkg_add.png" id="38" name="Picture"/>
+                    <pic:cNvPr descr="image/7.0sir_run_basic.jl.png" id="39" name="Picture"/>
                     <pic:cNvPicPr>
                       <a:picLocks noChangeArrowheads="1" noChangeAspect="1"/>
                     </pic:cNvPicPr>
                   </pic:nvPicPr>
                   <pic:blipFill>
-                    <a:blip r:embed="rId36"/>
-                    <a:stretch>
-                      <a:fillRect/>
-                    </a:stretch>
-                  </pic:blipFill>
-                  <pic:spPr bwMode="auto">
-                    <a:xfrm>
-                      <a:off x="0" y="0"/>
-                      <a:ext cx="2560320" cy="1440180"/>
-                    </a:xfrm>
-                    <a:prstGeom prst="rect">
-                      <a:avLst/>
-                    </a:prstGeom>
-                    <a:noFill/>
-                    <a:ln w="9525">
-                      <a:noFill/>
-                      <a:headEnd/>
-                      <a:tailEnd/>
-                    </a:ln>
-                  </pic:spPr>
-                </pic:pic>
-              </a:graphicData>
-            </a:graphic>
-          </wp:inline>
-        </w:drawing>
-      </w:r>
-      <w:r>
-        <w:t xml:space="preserve"> </w:t>
-      </w:r>
-      <w:r>
-        <w:drawing>
-          <wp:inline>
-            <wp:extent cx="2560320" cy="1440180"/>
-            <wp:effectExtent b="0" l="0" r="0" t="0"/>
-            <wp:docPr descr="" title="" id="40" name="Picture"/>
-            <a:graphic>
-              <a:graphicData uri="http://schemas.openxmlformats.org/drawingml/2006/picture">
-                <pic:pic>
-                  <pic:nvPicPr>
-                    <pic:cNvPr descr="image/6pkg_finished.png" id="41" name="Picture"/>
-                    <pic:cNvPicPr>
-                      <a:picLocks noChangeArrowheads="1" noChangeAspect="1"/>
-                    </pic:cNvPicPr>
-                  </pic:nvPicPr>
-                  <pic:blipFill>
-                    <a:blip r:embed="rId39"/>
-                    <a:stretch>
-                      <a:fillRect/>
-                    </a:stretch>
-                  </pic:blipFill>
-                  <pic:spPr bwMode="auto">
-                    <a:xfrm>
-                      <a:off x="0" y="0"/>
-                      <a:ext cx="2560320" cy="1440180"/>
-                    </a:xfrm>
-                    <a:prstGeom prst="rect">
-                      <a:avLst/>
-                    </a:prstGeom>
-                    <a:noFill/>
-                    <a:ln w="9525">
-                      <a:noFill/>
-                      <a:headEnd/>
-                      <a:tailEnd/>
-                    </a:ln>
-                  </pic:spPr>
-                </pic:pic>
-              </a:graphicData>
-            </a:graphic>
-          </wp:inline>
-        </w:drawing>
-      </w:r>
-    </w:p>
-    <w:bookmarkEnd w:id="42"/>
-    <w:bookmarkEnd w:id="43"/>
-    <w:bookmarkStart w:id="88" w:name="основные-эксперименты"/>
-    <w:p>
-      <w:pPr>
-        <w:pStyle w:val="Heading1"/>
-      </w:pPr>
-      <w:r>
-        <w:t xml:space="preserve">Основные эксперименты</w:t>
-      </w:r>
-    </w:p>
-    <w:bookmarkStart w:id="50" w:name="базовый-запуск"/>
-    <w:p>
-      <w:pPr>
-        <w:pStyle w:val="Heading2"/>
-      </w:pPr>
-      <w:r>
-        <w:t xml:space="preserve">1. Базовый запуск</w:t>
-      </w:r>
-    </w:p>
-    <w:p>
-      <w:pPr>
-        <w:pStyle w:val="FirstParagraph"/>
-      </w:pPr>
-      <w:r>
-        <w:drawing>
-          <wp:inline>
-            <wp:extent cx="2240280" cy="1260157"/>
-            <wp:effectExtent b="0" l="0" r="0" t="0"/>
-            <wp:docPr descr="" title="" id="45" name="Picture"/>
-            <a:graphic>
-              <a:graphicData uri="http://schemas.openxmlformats.org/drawingml/2006/picture">
-                <pic:pic>
-                  <pic:nvPicPr>
-                    <pic:cNvPr descr="image/7.0sir_run_basic.jl.png" id="46" name="Picture"/>
-                    <pic:cNvPicPr>
-                      <a:picLocks noChangeArrowheads="1" noChangeAspect="1"/>
-                    </pic:cNvPicPr>
-                  </pic:nvPicPr>
-                  <pic:blipFill>
-                    <a:blip r:embed="rId44"/>
+                    <a:blip r:embed="rId37"/>
                     <a:stretch>
                       <a:fillRect/>
                     </a:stretch>
@@ -1145,18 +1438,18 @@
           <wp:inline>
             <wp:extent cx="2880360" cy="1620202"/>
             <wp:effectExtent b="0" l="0" r="0" t="0"/>
-            <wp:docPr descr="" title="" id="48" name="Picture"/>
+            <wp:docPr descr="" title="" id="41" name="Picture"/>
             <a:graphic>
               <a:graphicData uri="http://schemas.openxmlformats.org/drawingml/2006/picture">
                 <pic:pic>
                   <pic:nvPicPr>
-                    <pic:cNvPr descr="image/7.1sir_basic_dynamics.png" id="49" name="Picture"/>
+                    <pic:cNvPr descr="image/7.1sir_basic_dynamics.png" id="42" name="Picture"/>
                     <pic:cNvPicPr>
                       <a:picLocks noChangeArrowheads="1" noChangeAspect="1"/>
                     </pic:cNvPicPr>
                   </pic:nvPicPr>
                   <pic:blipFill>
-                    <a:blip r:embed="rId47"/>
+                    <a:blip r:embed="rId40"/>
                     <a:stretch>
                       <a:fillRect/>
                     </a:stretch>
@@ -1188,7 +1481,7 @@
         <w:pStyle w:val="BodyText"/>
       </w:pPr>
       <w:r>
-        <w:t xml:space="preserve">Вывод:</w:t>
+        <w:t xml:space="preserve">Результат:</w:t>
       </w:r>
     </w:p>
     <w:p>
@@ -1200,7 +1493,7 @@
         </w:numPr>
       </w:pPr>
       <w:r>
-        <w:t xml:space="preserve">наблюдается типичная форма эпидемической волны;</w:t>
+        <w:t xml:space="preserve">наблюдается выраженная эпидемическая волна;</w:t>
       </w:r>
     </w:p>
     <w:p>
@@ -1212,40 +1505,87 @@
         </w:numPr>
       </w:pPr>
       <w:r>
-        <w:t xml:space="preserve">при выбранных параметрах эпидемия развивается устойчиво.</w:t>
-      </w:r>
-    </w:p>
-    <w:bookmarkEnd w:id="50"/>
-    <w:bookmarkStart w:id="60" w:name="literate-генерация"/>
+        <w:t xml:space="preserve">после пика доля инфицированных снижается за счёт перехода части популяции в состояние</w:t>
+      </w:r>
+      <w:r>
+        <w:t xml:space="preserve"> </w:t>
+      </w:r>
+      <w:r>
+        <w:rPr>
+          <w:rStyle w:val="VerbatimChar"/>
+        </w:rPr>
+        <w:t xml:space="preserve">R</w:t>
+      </w:r>
+      <w:r>
+        <w:t xml:space="preserve">;</w:t>
+      </w:r>
+    </w:p>
+    <w:p>
+      <w:pPr>
+        <w:pStyle w:val="Compact"/>
+        <w:numPr>
+          <w:ilvl w:val="0"/>
+          <w:numId w:val="1006"/>
+        </w:numPr>
+      </w:pPr>
+      <w:r>
+        <w:t xml:space="preserve">базовый сценарий принят как эталон для последующего сравнения.</w:t>
+      </w:r>
+    </w:p>
+    <w:bookmarkEnd w:id="43"/>
+    <w:bookmarkStart w:id="53" w:name="X52b4e889d90fa5f9ccfa7008481e6424edcd671"/>
     <w:p>
       <w:pPr>
         <w:pStyle w:val="Heading2"/>
       </w:pPr>
       <w:r>
-        <w:t xml:space="preserve">2. Literate-генерация</w:t>
+        <w:t xml:space="preserve">Эксперимент 2. Параметрический анализ по коэффициенту передачи</w:t>
       </w:r>
     </w:p>
     <w:p>
       <w:pPr>
         <w:pStyle w:val="FirstParagraph"/>
+      </w:pPr>
+      <w:r>
+        <w:t xml:space="preserve">Постановка: оценить чувствительность модели к изменению</w:t>
+      </w:r>
+      <w:r>
+        <w:t xml:space="preserve"> </w:t>
+      </w:r>
+      <w:r>
+        <w:rPr>
+          <w:rStyle w:val="VerbatimChar"/>
+        </w:rPr>
+        <w:t xml:space="preserve">beta</w:t>
+      </w:r>
+      <w:r>
+        <w:t xml:space="preserve"> </w:t>
+      </w:r>
+      <w:r>
+        <w:t xml:space="preserve">и выявить границу между затухающим и развивающимся процессом.</w:t>
+      </w:r>
+    </w:p>
+    <w:p>
+      <w:pPr>
+        <w:pStyle w:val="BodyText"/>
       </w:pPr>
       <w:r>
         <w:drawing>
           <wp:inline>
-            <wp:extent cx="1706880" cy="960120"/>
+            <wp:extent cx="2026920" cy="1140142"/>
             <wp:effectExtent b="0" l="0" r="0" t="0"/>
-            <wp:docPr descr="" title="" id="52" name="Picture"/>
+            <wp:docPr descr="" title="" id="45" name="Picture"/>
             <a:graphic>
               <a:graphicData uri="http://schemas.openxmlformats.org/drawingml/2006/picture">
                 <pic:pic>
                   <pic:nvPicPr>
-                    <pic:cNvPr descr="image/8sir_run_basic_clean.png" id="53" name="Picture"/>
+                    <pic:cNvPr descr="image/11.0sir_scan_beta.jl.png" id="46" name="Picture"/>
                     <pic:cNvPicPr>
                       <a:picLocks noChangeArrowheads="1" noChangeAspect="1"/>
                     </pic:cNvPicPr>
                   </pic:nvPicPr>
                   <pic:blipFill>
-                    <a:blip r:embed="rId51"/>
+                    <a:blip r:embed="rId44"/>
                     <a:stretch>
                       <a:fillRect/>
                     </a:stretch>
@@ -1253,7 +1593,7 @@
                   <pic:spPr bwMode="auto">
                     <a:xfrm>
                       <a:off x="0" y="0"/>
-                      <a:ext cx="1706880" cy="960120"/>
+                      <a:ext cx="2026920" cy="1140142"/>
                     </a:xfrm>
                     <a:prstGeom prst="rect">
                       <a:avLst/>
@@ -1277,20 +1617,20 @@
       <w:r>
         <w:drawing>
           <wp:inline>
-            <wp:extent cx="1706880" cy="960120"/>
+            <wp:extent cx="2987040" cy="1680210"/>
             <wp:effectExtent b="0" l="0" r="0" t="0"/>
-            <wp:docPr descr="" title="" id="55" name="Picture"/>
+            <wp:docPr descr="" title="" id="48" name="Picture"/>
             <a:graphic>
               <a:graphicData uri="http://schemas.openxmlformats.org/drawingml/2006/picture">
                 <pic:pic>
                   <pic:nvPicPr>
-                    <pic:cNvPr descr="image/9sir_run_basic_literate.md.png" id="56" name="Picture"/>
+                    <pic:cNvPr descr="image/11.1beta_scan.png" id="49" name="Picture"/>
                     <pic:cNvPicPr>
                       <a:picLocks noChangeArrowheads="1" noChangeAspect="1"/>
                     </pic:cNvPicPr>
                   </pic:nvPicPr>
                   <pic:blipFill>
-                    <a:blip r:embed="rId54"/>
+                    <a:blip r:embed="rId47"/>
                     <a:stretch>
                       <a:fillRect/>
                     </a:stretch>
@@ -1298,7 +1638,7 @@
                   <pic:spPr bwMode="auto">
                     <a:xfrm>
                       <a:off x="0" y="0"/>
-                      <a:ext cx="1706880" cy="960120"/>
+                      <a:ext cx="2987040" cy="1680210"/>
                     </a:xfrm>
                     <a:prstGeom prst="rect">
                       <a:avLst/>
@@ -1316,26 +1656,28 @@
           </wp:inline>
         </w:drawing>
       </w:r>
-      <w:r>
-        <w:t xml:space="preserve"> </w:t>
-      </w:r>
+    </w:p>
+    <w:p>
+      <w:pPr>
+        <w:pStyle w:val="BodyText"/>
+      </w:pPr>
       <w:r>
         <w:drawing>
           <wp:inline>
-            <wp:extent cx="1706880" cy="960120"/>
+            <wp:extent cx="2933700" cy="1650206"/>
             <wp:effectExtent b="0" l="0" r="0" t="0"/>
-            <wp:docPr descr="" title="" id="58" name="Picture"/>
+            <wp:docPr descr="" title="" id="51" name="Picture"/>
             <a:graphic>
               <a:graphicData uri="http://schemas.openxmlformats.org/drawingml/2006/picture">
                 <pic:pic>
                   <pic:nvPicPr>
-                    <pic:cNvPr descr="image/10sir_run_basic_literate.ipynb.png" id="59" name="Picture"/>
+                    <pic:cNvPr descr="image/11.2beta_scan_all.csv.png" id="52" name="Picture"/>
                     <pic:cNvPicPr>
                       <a:picLocks noChangeArrowheads="1" noChangeAspect="1"/>
                     </pic:cNvPicPr>
                   </pic:nvPicPr>
                   <pic:blipFill>
-                    <a:blip r:embed="rId57"/>
+                    <a:blip r:embed="rId50"/>
                     <a:stretch>
                       <a:fillRect/>
                     </a:stretch>
@@ -1343,7 +1685,7 @@
                   <pic:spPr bwMode="auto">
                     <a:xfrm>
                       <a:off x="0" y="0"/>
-                      <a:ext cx="1706880" cy="960120"/>
+                      <a:ext cx="2933700" cy="1650206"/>
                     </a:xfrm>
                     <a:prstGeom prst="rect">
                       <a:avLst/>
@@ -1367,7 +1709,7 @@
         <w:pStyle w:val="BodyText"/>
       </w:pPr>
       <w:r>
-        <w:t xml:space="preserve">Вывод:</w:t>
+        <w:t xml:space="preserve">Результат:</w:t>
       </w:r>
     </w:p>
     <w:p>
@@ -1379,62 +1721,7 @@
         </w:numPr>
       </w:pPr>
       <w:r>
-        <w:t xml:space="preserve">получены три формата (</w:t>
-      </w:r>
-      <w:r>
-        <w:rPr>
-          <w:rStyle w:val="VerbatimChar"/>
-        </w:rPr>
-        <w:t xml:space="preserve">.jl</w:t>
-      </w:r>
-      <w:r>
-        <w:t xml:space="preserve">,</w:t>
-      </w:r>
-      <w:r>
-        <w:t xml:space="preserve"> </w:t>
-      </w:r>
-      <w:r>
-        <w:rPr>
-          <w:rStyle w:val="VerbatimChar"/>
-        </w:rPr>
-        <w:t xml:space="preserve">.md</w:t>
-      </w:r>
-      <w:r>
-        <w:t xml:space="preserve">,</w:t>
-      </w:r>
-      <w:r>
-        <w:t xml:space="preserve"> </w:t>
-      </w:r>
-      <w:r>
-        <w:rPr>
-          <w:rStyle w:val="VerbatimChar"/>
-        </w:rPr>
-        <w:t xml:space="preserve">.ipynb</w:t>
-      </w:r>
-      <w:r>
-        <w:t xml:space="preserve">) из одного источника;</w:t>
-      </w:r>
-    </w:p>
-    <w:p>
-      <w:pPr>
-        <w:pStyle w:val="Compact"/>
-        <w:numPr>
-          <w:ilvl w:val="0"/>
-          <w:numId w:val="1007"/>
-        </w:numPr>
-      </w:pPr>
-      <w:r>
-        <w:t xml:space="preserve">повышена воспроизводимость и проверяемость экспериментов.</w:t>
-      </w:r>
-    </w:p>
-    <w:bookmarkEnd w:id="60"/>
-    <w:bookmarkStart w:id="70" w:name="сканирование-beta"/>
-    <w:p>
-      <w:pPr>
-        <w:pStyle w:val="Heading2"/>
-      </w:pPr>
-      <w:r>
-        <w:t xml:space="preserve">3. Сканирование</w:t>
+        <w:t xml:space="preserve">при увеличении</w:t>
       </w:r>
       <w:r>
         <w:t xml:space="preserve"> </w:t>
@@ -1445,28 +1732,76 @@
         </w:rPr>
         <w:t xml:space="preserve">beta</w:t>
       </w:r>
+      <w:r>
+        <w:t xml:space="preserve"> </w:t>
+      </w:r>
+      <w:r>
+        <w:t xml:space="preserve">растут пик инфицированных и скорость выхода к пику;</w:t>
+      </w:r>
+    </w:p>
+    <w:p>
+      <w:pPr>
+        <w:pStyle w:val="Compact"/>
+        <w:numPr>
+          <w:ilvl w:val="0"/>
+          <w:numId w:val="1007"/>
+        </w:numPr>
+      </w:pPr>
+      <w:r>
+        <w:t xml:space="preserve">фиксируется пороговый режим: ниже определённых значений вспышка ограничена, выше — переходит в интенсивную фазу;</w:t>
+      </w:r>
+    </w:p>
+    <w:p>
+      <w:pPr>
+        <w:pStyle w:val="Compact"/>
+        <w:numPr>
+          <w:ilvl w:val="0"/>
+          <w:numId w:val="1007"/>
+        </w:numPr>
+      </w:pPr>
+      <w:r>
+        <w:t xml:space="preserve">эксперимент подтверждает ключевую роль контактной передачи в динамике.</w:t>
+      </w:r>
+    </w:p>
+    <w:bookmarkEnd w:id="53"/>
+    <w:bookmarkStart w:id="63" w:name="Xdf996f7541d0b2f891c3f7b3e1ac78505ff0315"/>
+    <w:p>
+      <w:pPr>
+        <w:pStyle w:val="Heading2"/>
+      </w:pPr>
+      <w:r>
+        <w:t xml:space="preserve">Эксперимент 3. Влияние миграции между подгруппами</w:t>
+      </w:r>
     </w:p>
     <w:p>
       <w:pPr>
         <w:pStyle w:val="FirstParagraph"/>
+      </w:pPr>
+      <w:r>
+        <w:t xml:space="preserve">Постановка: исследовать, как межгрупповая мобильность ускоряет распространение инфекции.</w:t>
+      </w:r>
+    </w:p>
+    <w:p>
+      <w:pPr>
+        <w:pStyle w:val="BodyText"/>
       </w:pPr>
       <w:r>
         <w:drawing>
           <wp:inline>
-            <wp:extent cx="1920240" cy="1080135"/>
+            <wp:extent cx="2026920" cy="1140142"/>
             <wp:effectExtent b="0" l="0" r="0" t="0"/>
-            <wp:docPr descr="" title="" id="62" name="Picture"/>
+            <wp:docPr descr="" title="" id="55" name="Picture"/>
             <a:graphic>
               <a:graphicData uri="http://schemas.openxmlformats.org/drawingml/2006/picture">
                 <pic:pic>
                   <pic:nvPicPr>
-                    <pic:cNvPr descr="image/11.0sir_scan_beta.jl.png" id="63" name="Picture"/>
+                    <pic:cNvPr descr="image/15.0sir_migration_effect.png" id="56" name="Picture"/>
                     <pic:cNvPicPr>
                       <a:picLocks noChangeArrowheads="1" noChangeAspect="1"/>
                     </pic:cNvPicPr>
                   </pic:nvPicPr>
                   <pic:blipFill>
-                    <a:blip r:embed="rId61"/>
+                    <a:blip r:embed="rId54"/>
                     <a:stretch>
                       <a:fillRect/>
                     </a:stretch>
@@ -1474,7 +1809,7 @@
                   <pic:spPr bwMode="auto">
                     <a:xfrm>
                       <a:off x="0" y="0"/>
-                      <a:ext cx="1920240" cy="1080135"/>
+                      <a:ext cx="2026920" cy="1140142"/>
                     </a:xfrm>
                     <a:prstGeom prst="rect">
                       <a:avLst/>
@@ -1498,20 +1833,670 @@
       <w:r>
         <w:drawing>
           <wp:inline>
-            <wp:extent cx="3093720" cy="1740217"/>
+            <wp:extent cx="2987040" cy="1680210"/>
+            <wp:effectExtent b="0" l="0" r="0" t="0"/>
+            <wp:docPr descr="" title="" id="58" name="Picture"/>
+            <a:graphic>
+              <a:graphicData uri="http://schemas.openxmlformats.org/drawingml/2006/picture">
+                <pic:pic>
+                  <pic:nvPicPr>
+                    <pic:cNvPr descr="image/15.1migration_effect.png" id="59" name="Picture"/>
+                    <pic:cNvPicPr>
+                      <a:picLocks noChangeArrowheads="1" noChangeAspect="1"/>
+                    </pic:cNvPicPr>
+                  </pic:nvPicPr>
+                  <pic:blipFill>
+                    <a:blip r:embed="rId57"/>
+                    <a:stretch>
+                      <a:fillRect/>
+                    </a:stretch>
+                  </pic:blipFill>
+                  <pic:spPr bwMode="auto">
+                    <a:xfrm>
+                      <a:off x="0" y="0"/>
+                      <a:ext cx="2987040" cy="1680210"/>
+                    </a:xfrm>
+                    <a:prstGeom prst="rect">
+                      <a:avLst/>
+                    </a:prstGeom>
+                    <a:noFill/>
+                    <a:ln w="9525">
+                      <a:noFill/>
+                      <a:headEnd/>
+                      <a:tailEnd/>
+                    </a:ln>
+                  </pic:spPr>
+                </pic:pic>
+              </a:graphicData>
+            </a:graphic>
+          </wp:inline>
+        </w:drawing>
+      </w:r>
+    </w:p>
+    <w:p>
+      <w:pPr>
+        <w:pStyle w:val="BodyText"/>
+      </w:pPr>
+      <w:r>
+        <w:drawing>
+          <wp:inline>
+            <wp:extent cx="2933700" cy="1650206"/>
+            <wp:effectExtent b="0" l="0" r="0" t="0"/>
+            <wp:docPr descr="" title="" id="61" name="Picture"/>
+            <a:graphic>
+              <a:graphicData uri="http://schemas.openxmlformats.org/drawingml/2006/picture">
+                <pic:pic>
+                  <pic:nvPicPr>
+                    <pic:cNvPr descr="image/15.2migration_scan_all.csv.png" id="62" name="Picture"/>
+                    <pic:cNvPicPr>
+                      <a:picLocks noChangeArrowheads="1" noChangeAspect="1"/>
+                    </pic:cNvPicPr>
+                  </pic:nvPicPr>
+                  <pic:blipFill>
+                    <a:blip r:embed="rId60"/>
+                    <a:stretch>
+                      <a:fillRect/>
+                    </a:stretch>
+                  </pic:blipFill>
+                  <pic:spPr bwMode="auto">
+                    <a:xfrm>
+                      <a:off x="0" y="0"/>
+                      <a:ext cx="2933700" cy="1650206"/>
+                    </a:xfrm>
+                    <a:prstGeom prst="rect">
+                      <a:avLst/>
+                    </a:prstGeom>
+                    <a:noFill/>
+                    <a:ln w="9525">
+                      <a:noFill/>
+                      <a:headEnd/>
+                      <a:tailEnd/>
+                    </a:ln>
+                  </pic:spPr>
+                </pic:pic>
+              </a:graphicData>
+            </a:graphic>
+          </wp:inline>
+        </w:drawing>
+      </w:r>
+    </w:p>
+    <w:p>
+      <w:pPr>
+        <w:pStyle w:val="BodyText"/>
+      </w:pPr>
+      <w:r>
+        <w:t xml:space="preserve">Результат:</w:t>
+      </w:r>
+    </w:p>
+    <w:p>
+      <w:pPr>
+        <w:pStyle w:val="Compact"/>
+        <w:numPr>
+          <w:ilvl w:val="0"/>
+          <w:numId w:val="1008"/>
+        </w:numPr>
+      </w:pPr>
+      <w:r>
+        <w:t xml:space="preserve">миграция сокращает время синхронизации вспышек между группами;</w:t>
+      </w:r>
+    </w:p>
+    <w:p>
+      <w:pPr>
+        <w:pStyle w:val="Compact"/>
+        <w:numPr>
+          <w:ilvl w:val="0"/>
+          <w:numId w:val="1008"/>
+        </w:numPr>
+      </w:pPr>
+      <w:r>
+        <w:t xml:space="preserve">увеличивается общий охват инфекции на ранних этапах;</w:t>
+      </w:r>
+    </w:p>
+    <w:p>
+      <w:pPr>
+        <w:pStyle w:val="Compact"/>
+        <w:numPr>
+          <w:ilvl w:val="0"/>
+          <w:numId w:val="1008"/>
+        </w:numPr>
+      </w:pPr>
+      <w:r>
+        <w:t xml:space="preserve">при низкой мобильности динамика остаётся более локализованной.</w:t>
+      </w:r>
+    </w:p>
+    <w:bookmarkEnd w:id="63"/>
+    <w:bookmarkStart w:id="73" w:name="эксперимент-4.-гетерогенность-популяции"/>
+    <w:p>
+      <w:pPr>
+        <w:pStyle w:val="Heading2"/>
+      </w:pPr>
+      <w:r>
+        <w:t xml:space="preserve">Эксперимент 4. Гетерогенность популяции</w:t>
+      </w:r>
+    </w:p>
+    <w:p>
+      <w:pPr>
+        <w:pStyle w:val="FirstParagraph"/>
+      </w:pPr>
+      <w:r>
+        <w:t xml:space="preserve">Постановка: проверить, как неоднородность параметров агентов влияет на форму эпидемической кривой.</w:t>
+      </w:r>
+    </w:p>
+    <w:p>
+      <w:pPr>
+        <w:pStyle w:val="BodyText"/>
+      </w:pPr>
+      <w:r>
+        <w:drawing>
+          <wp:inline>
+            <wp:extent cx="1813560" cy="1020127"/>
             <wp:effectExtent b="0" l="0" r="0" t="0"/>
             <wp:docPr descr="" title="" id="65" name="Picture"/>
             <a:graphic>
               <a:graphicData uri="http://schemas.openxmlformats.org/drawingml/2006/picture">
                 <pic:pic>
                   <pic:nvPicPr>
-                    <pic:cNvPr descr="image/11.1beta_scan.png" id="66" name="Picture"/>
+                    <pic:cNvPr descr="image/27.0sir_heterogeneity_effect.jl.png" id="66" name="Picture"/>
                     <pic:cNvPicPr>
                       <a:picLocks noChangeArrowheads="1" noChangeAspect="1"/>
                     </pic:cNvPicPr>
                   </pic:nvPicPr>
                   <pic:blipFill>
                     <a:blip r:embed="rId64"/>
+                    <a:stretch>
+                      <a:fillRect/>
+                    </a:stretch>
+                  </pic:blipFill>
+                  <pic:spPr bwMode="auto">
+                    <a:xfrm>
+                      <a:off x="0" y="0"/>
+                      <a:ext cx="1813560" cy="1020127"/>
+                    </a:xfrm>
+                    <a:prstGeom prst="rect">
+                      <a:avLst/>
+                    </a:prstGeom>
+                    <a:noFill/>
+                    <a:ln w="9525">
+                      <a:noFill/>
+                      <a:headEnd/>
+                      <a:tailEnd/>
+                    </a:ln>
+                  </pic:spPr>
+                </pic:pic>
+              </a:graphicData>
+            </a:graphic>
+          </wp:inline>
+        </w:drawing>
+      </w:r>
+      <w:r>
+        <w:t xml:space="preserve"> </w:t>
+      </w:r>
+      <w:r>
+        <w:drawing>
+          <wp:inline>
+            <wp:extent cx="3307080" cy="1860232"/>
+            <wp:effectExtent b="0" l="0" r="0" t="0"/>
+            <wp:docPr descr="" title="" id="68" name="Picture"/>
+            <a:graphic>
+              <a:graphicData uri="http://schemas.openxmlformats.org/drawingml/2006/picture">
+                <pic:pic>
+                  <pic:nvPicPr>
+                    <pic:cNvPr descr="image/27.1heterogeneity_effect.png" id="69" name="Picture"/>
+                    <pic:cNvPicPr>
+                      <a:picLocks noChangeArrowheads="1" noChangeAspect="1"/>
+                    </pic:cNvPicPr>
+                  </pic:nvPicPr>
+                  <pic:blipFill>
+                    <a:blip r:embed="rId67"/>
+                    <a:stretch>
+                      <a:fillRect/>
+                    </a:stretch>
+                  </pic:blipFill>
+                  <pic:spPr bwMode="auto">
+                    <a:xfrm>
+                      <a:off x="0" y="0"/>
+                      <a:ext cx="3307080" cy="1860232"/>
+                    </a:xfrm>
+                    <a:prstGeom prst="rect">
+                      <a:avLst/>
+                    </a:prstGeom>
+                    <a:noFill/>
+                    <a:ln w="9525">
+                      <a:noFill/>
+                      <a:headEnd/>
+                      <a:tailEnd/>
+                    </a:ln>
+                  </pic:spPr>
+                </pic:pic>
+              </a:graphicData>
+            </a:graphic>
+          </wp:inline>
+        </w:drawing>
+      </w:r>
+    </w:p>
+    <w:p>
+      <w:pPr>
+        <w:pStyle w:val="BodyText"/>
+      </w:pPr>
+      <w:r>
+        <w:drawing>
+          <wp:inline>
+            <wp:extent cx="2933700" cy="1650206"/>
+            <wp:effectExtent b="0" l="0" r="0" t="0"/>
+            <wp:docPr descr="" title="" id="71" name="Picture"/>
+            <a:graphic>
+              <a:graphicData uri="http://schemas.openxmlformats.org/drawingml/2006/picture">
+                <pic:pic>
+                  <pic:nvPicPr>
+                    <pic:cNvPr descr="image/27.3heterogeneity_summary.csv.png" id="72" name="Picture"/>
+                    <pic:cNvPicPr>
+                      <a:picLocks noChangeArrowheads="1" noChangeAspect="1"/>
+                    </pic:cNvPicPr>
+                  </pic:nvPicPr>
+                  <pic:blipFill>
+                    <a:blip r:embed="rId70"/>
+                    <a:stretch>
+                      <a:fillRect/>
+                    </a:stretch>
+                  </pic:blipFill>
+                  <pic:spPr bwMode="auto">
+                    <a:xfrm>
+                      <a:off x="0" y="0"/>
+                      <a:ext cx="2933700" cy="1650206"/>
+                    </a:xfrm>
+                    <a:prstGeom prst="rect">
+                      <a:avLst/>
+                    </a:prstGeom>
+                    <a:noFill/>
+                    <a:ln w="9525">
+                      <a:noFill/>
+                      <a:headEnd/>
+                      <a:tailEnd/>
+                    </a:ln>
+                  </pic:spPr>
+                </pic:pic>
+              </a:graphicData>
+            </a:graphic>
+          </wp:inline>
+        </w:drawing>
+      </w:r>
+    </w:p>
+    <w:p>
+      <w:pPr>
+        <w:pStyle w:val="BodyText"/>
+      </w:pPr>
+      <w:r>
+        <w:t xml:space="preserve">Результат:</w:t>
+      </w:r>
+    </w:p>
+    <w:p>
+      <w:pPr>
+        <w:pStyle w:val="Compact"/>
+        <w:numPr>
+          <w:ilvl w:val="0"/>
+          <w:numId w:val="1009"/>
+        </w:numPr>
+      </w:pPr>
+      <w:r>
+        <w:t xml:space="preserve">распределение риска становится неравномерным;</w:t>
+      </w:r>
+    </w:p>
+    <w:p>
+      <w:pPr>
+        <w:pStyle w:val="Compact"/>
+        <w:numPr>
+          <w:ilvl w:val="0"/>
+          <w:numId w:val="1009"/>
+        </w:numPr>
+      </w:pPr>
+      <w:r>
+        <w:t xml:space="preserve">пик может смещаться во времени и изменяться по высоте;</w:t>
+      </w:r>
+    </w:p>
+    <w:p>
+      <w:pPr>
+        <w:pStyle w:val="Compact"/>
+        <w:numPr>
+          <w:ilvl w:val="0"/>
+          <w:numId w:val="1009"/>
+        </w:numPr>
+      </w:pPr>
+      <w:r>
+        <w:t xml:space="preserve">усреднённые показатели менее информативны без анализа подгрупп.</w:t>
+      </w:r>
+    </w:p>
+    <w:bookmarkEnd w:id="73"/>
+    <w:bookmarkStart w:id="83" w:name="эксперимент-5.-эффект-карантинных-мер"/>
+    <w:p>
+      <w:pPr>
+        <w:pStyle w:val="Heading2"/>
+      </w:pPr>
+      <w:r>
+        <w:t xml:space="preserve">Эксперимент 5. Эффект карантинных мер</w:t>
+      </w:r>
+    </w:p>
+    <w:p>
+      <w:pPr>
+        <w:pStyle w:val="FirstParagraph"/>
+      </w:pPr>
+      <w:r>
+        <w:t xml:space="preserve">Постановка: сравнить динамику без вмешательств и при активации карантина.</w:t>
+      </w:r>
+    </w:p>
+    <w:p>
+      <w:pPr>
+        <w:pStyle w:val="BodyText"/>
+      </w:pPr>
+      <w:r>
+        <w:drawing>
+          <wp:inline>
+            <wp:extent cx="1813560" cy="1020127"/>
+            <wp:effectExtent b="0" l="0" r="0" t="0"/>
+            <wp:docPr descr="" title="" id="75" name="Picture"/>
+            <a:graphic>
+              <a:graphicData uri="http://schemas.openxmlformats.org/drawingml/2006/picture">
+                <pic:pic>
+                  <pic:nvPicPr>
+                    <pic:cNvPr descr="image/31.0sir_quarantine_effect.png" id="76" name="Picture"/>
+                    <pic:cNvPicPr>
+                      <a:picLocks noChangeArrowheads="1" noChangeAspect="1"/>
+                    </pic:cNvPicPr>
+                  </pic:nvPicPr>
+                  <pic:blipFill>
+                    <a:blip r:embed="rId74"/>
+                    <a:stretch>
+                      <a:fillRect/>
+                    </a:stretch>
+                  </pic:blipFill>
+                  <pic:spPr bwMode="auto">
+                    <a:xfrm>
+                      <a:off x="0" y="0"/>
+                      <a:ext cx="1813560" cy="1020127"/>
+                    </a:xfrm>
+                    <a:prstGeom prst="rect">
+                      <a:avLst/>
+                    </a:prstGeom>
+                    <a:noFill/>
+                    <a:ln w="9525">
+                      <a:noFill/>
+                      <a:headEnd/>
+                      <a:tailEnd/>
+                    </a:ln>
+                  </pic:spPr>
+                </pic:pic>
+              </a:graphicData>
+            </a:graphic>
+          </wp:inline>
+        </w:drawing>
+      </w:r>
+      <w:r>
+        <w:t xml:space="preserve"> </w:t>
+      </w:r>
+      <w:r>
+        <w:drawing>
+          <wp:inline>
+            <wp:extent cx="3307080" cy="1860232"/>
+            <wp:effectExtent b="0" l="0" r="0" t="0"/>
+            <wp:docPr descr="" title="" id="78" name="Picture"/>
+            <a:graphic>
+              <a:graphicData uri="http://schemas.openxmlformats.org/drawingml/2006/picture">
+                <pic:pic>
+                  <pic:nvPicPr>
+                    <pic:cNvPr descr="image/31.1quarantine_effect.png" id="79" name="Picture"/>
+                    <pic:cNvPicPr>
+                      <a:picLocks noChangeArrowheads="1" noChangeAspect="1"/>
+                    </pic:cNvPicPr>
+                  </pic:nvPicPr>
+                  <pic:blipFill>
+                    <a:blip r:embed="rId77"/>
+                    <a:stretch>
+                      <a:fillRect/>
+                    </a:stretch>
+                  </pic:blipFill>
+                  <pic:spPr bwMode="auto">
+                    <a:xfrm>
+                      <a:off x="0" y="0"/>
+                      <a:ext cx="3307080" cy="1860232"/>
+                    </a:xfrm>
+                    <a:prstGeom prst="rect">
+                      <a:avLst/>
+                    </a:prstGeom>
+                    <a:noFill/>
+                    <a:ln w="9525">
+                      <a:noFill/>
+                      <a:headEnd/>
+                      <a:tailEnd/>
+                    </a:ln>
+                  </pic:spPr>
+                </pic:pic>
+              </a:graphicData>
+            </a:graphic>
+          </wp:inline>
+        </w:drawing>
+      </w:r>
+    </w:p>
+    <w:p>
+      <w:pPr>
+        <w:pStyle w:val="BodyText"/>
+      </w:pPr>
+      <w:r>
+        <w:drawing>
+          <wp:inline>
+            <wp:extent cx="2933700" cy="1650206"/>
+            <wp:effectExtent b="0" l="0" r="0" t="0"/>
+            <wp:docPr descr="" title="" id="81" name="Picture"/>
+            <a:graphic>
+              <a:graphicData uri="http://schemas.openxmlformats.org/drawingml/2006/picture">
+                <pic:pic>
+                  <pic:nvPicPr>
+                    <pic:cNvPr descr="image/31.4quarantine_summary.csv.png" id="82" name="Picture"/>
+                    <pic:cNvPicPr>
+                      <a:picLocks noChangeArrowheads="1" noChangeAspect="1"/>
+                    </pic:cNvPicPr>
+                  </pic:nvPicPr>
+                  <pic:blipFill>
+                    <a:blip r:embed="rId80"/>
+                    <a:stretch>
+                      <a:fillRect/>
+                    </a:stretch>
+                  </pic:blipFill>
+                  <pic:spPr bwMode="auto">
+                    <a:xfrm>
+                      <a:off x="0" y="0"/>
+                      <a:ext cx="2933700" cy="1650206"/>
+                    </a:xfrm>
+                    <a:prstGeom prst="rect">
+                      <a:avLst/>
+                    </a:prstGeom>
+                    <a:noFill/>
+                    <a:ln w="9525">
+                      <a:noFill/>
+                      <a:headEnd/>
+                      <a:tailEnd/>
+                    </a:ln>
+                  </pic:spPr>
+                </pic:pic>
+              </a:graphicData>
+            </a:graphic>
+          </wp:inline>
+        </w:drawing>
+      </w:r>
+    </w:p>
+    <w:p>
+      <w:pPr>
+        <w:pStyle w:val="BodyText"/>
+      </w:pPr>
+      <w:r>
+        <w:t xml:space="preserve">Результат:</w:t>
+      </w:r>
+    </w:p>
+    <w:p>
+      <w:pPr>
+        <w:pStyle w:val="Compact"/>
+        <w:numPr>
+          <w:ilvl w:val="0"/>
+          <w:numId w:val="1010"/>
+        </w:numPr>
+      </w:pPr>
+      <w:r>
+        <w:t xml:space="preserve">карантин снижает интенсивность передачи и сглаживает пик нагрузки;</w:t>
+      </w:r>
+    </w:p>
+    <w:p>
+      <w:pPr>
+        <w:pStyle w:val="Compact"/>
+        <w:numPr>
+          <w:ilvl w:val="0"/>
+          <w:numId w:val="1010"/>
+        </w:numPr>
+      </w:pPr>
+      <w:r>
+        <w:t xml:space="preserve">увеличивается длительность процесса, но уменьшается критическая перегрузка;</w:t>
+      </w:r>
+    </w:p>
+    <w:p>
+      <w:pPr>
+        <w:pStyle w:val="Compact"/>
+        <w:numPr>
+          <w:ilvl w:val="0"/>
+          <w:numId w:val="1010"/>
+        </w:numPr>
+      </w:pPr>
+      <w:r>
+        <w:t xml:space="preserve">мера эффективна при своевременном включении и достаточной строгости.</w:t>
+      </w:r>
+    </w:p>
+    <w:bookmarkEnd w:id="83"/>
+    <w:bookmarkStart w:id="93" w:name="Xb808e27b1ca3b1ccdb62883da103745b4e52604"/>
+    <w:p>
+      <w:pPr>
+        <w:pStyle w:val="Heading2"/>
+      </w:pPr>
+      <w:r>
+        <w:t xml:space="preserve">Эксперимент 6. Подбор параметров (оптимизация)</w:t>
+      </w:r>
+    </w:p>
+    <w:p>
+      <w:pPr>
+        <w:pStyle w:val="FirstParagraph"/>
+      </w:pPr>
+      <w:r>
+        <w:t xml:space="preserve">Постановка: подобрать параметры, минимизирующие эпидемический ущерб при заданных ограничениях.</w:t>
+      </w:r>
+    </w:p>
+    <w:p>
+      <w:pPr>
+        <w:pStyle w:val="BodyText"/>
+      </w:pPr>
+      <w:r>
+        <w:drawing>
+          <wp:inline>
+            <wp:extent cx="2346960" cy="1320165"/>
+            <wp:effectExtent b="0" l="0" r="0" t="0"/>
+            <wp:docPr descr="" title="" id="85" name="Picture"/>
+            <a:graphic>
+              <a:graphicData uri="http://schemas.openxmlformats.org/drawingml/2006/picture">
+                <pic:pic>
+                  <pic:nvPicPr>
+                    <pic:cNvPr descr="image/35sir_optimize_with_constraint.png" id="86" name="Picture"/>
+                    <pic:cNvPicPr>
+                      <a:picLocks noChangeArrowheads="1" noChangeAspect="1"/>
+                    </pic:cNvPicPr>
+                  </pic:nvPicPr>
+                  <pic:blipFill>
+                    <a:blip r:embed="rId84"/>
+                    <a:stretch>
+                      <a:fillRect/>
+                    </a:stretch>
+                  </pic:blipFill>
+                  <pic:spPr bwMode="auto">
+                    <a:xfrm>
+                      <a:off x="0" y="0"/>
+                      <a:ext cx="2346960" cy="1320165"/>
+                    </a:xfrm>
+                    <a:prstGeom prst="rect">
+                      <a:avLst/>
+                    </a:prstGeom>
+                    <a:noFill/>
+                    <a:ln w="9525">
+                      <a:noFill/>
+                      <a:headEnd/>
+                      <a:tailEnd/>
+                    </a:ln>
+                  </pic:spPr>
+                </pic:pic>
+              </a:graphicData>
+            </a:graphic>
+          </wp:inline>
+        </w:drawing>
+      </w:r>
+      <w:r>
+        <w:t xml:space="preserve"> </w:t>
+      </w:r>
+      <w:r>
+        <w:drawing>
+          <wp:inline>
+            <wp:extent cx="2773680" cy="1560195"/>
+            <wp:effectExtent b="0" l="0" r="0" t="0"/>
+            <wp:docPr descr="" title="" id="88" name="Picture"/>
+            <a:graphic>
+              <a:graphicData uri="http://schemas.openxmlformats.org/drawingml/2006/picture">
+                <pic:pic>
+                  <pic:nvPicPr>
+                    <pic:cNvPr descr="image/23.1comprehensive_analysis.png" id="89" name="Picture"/>
+                    <pic:cNvPicPr>
+                      <a:picLocks noChangeArrowheads="1" noChangeAspect="1"/>
+                    </pic:cNvPicPr>
+                  </pic:nvPicPr>
+                  <pic:blipFill>
+                    <a:blip r:embed="rId87"/>
+                    <a:stretch>
+                      <a:fillRect/>
+                    </a:stretch>
+                  </pic:blipFill>
+                  <pic:spPr bwMode="auto">
+                    <a:xfrm>
+                      <a:off x="0" y="0"/>
+                      <a:ext cx="2773680" cy="1560195"/>
+                    </a:xfrm>
+                    <a:prstGeom prst="rect">
+                      <a:avLst/>
+                    </a:prstGeom>
+                    <a:noFill/>
+                    <a:ln w="9525">
+                      <a:noFill/>
+                      <a:headEnd/>
+                      <a:tailEnd/>
+                    </a:ln>
+                  </pic:spPr>
+                </pic:pic>
+              </a:graphicData>
+            </a:graphic>
+          </wp:inline>
+        </w:drawing>
+      </w:r>
+    </w:p>
+    <w:p>
+      <w:pPr>
+        <w:pStyle w:val="BodyText"/>
+      </w:pPr>
+      <w:r>
+        <w:drawing>
+          <wp:inline>
+            <wp:extent cx="3093720" cy="1740217"/>
+            <wp:effectExtent b="0" l="0" r="0" t="0"/>
+            <wp:docPr descr="" title="" id="91" name="Picture"/>
+            <a:graphic>
+              <a:graphicData uri="http://schemas.openxmlformats.org/drawingml/2006/picture">
+                <pic:pic>
+                  <pic:nvPicPr>
+                    <pic:cNvPr descr="image/38.1optimization_with_constraint.csv.png" id="92" name="Picture"/>
+                    <pic:cNvPicPr>
+                      <a:picLocks noChangeArrowheads="1" noChangeAspect="1"/>
+                    </pic:cNvPicPr>
+                  </pic:nvPicPr>
+                  <pic:blipFill>
+                    <a:blip r:embed="rId90"/>
                     <a:stretch>
                       <a:fillRect/>
                     </a:stretch>
@@ -1543,1139 +2528,480 @@
         <w:pStyle w:val="BodyText"/>
       </w:pPr>
       <w:r>
-        <w:drawing>
-          <wp:inline>
-            <wp:extent cx="2400300" cy="1350168"/>
-            <wp:effectExtent b="0" l="0" r="0" t="0"/>
-            <wp:docPr descr="" title="" id="68" name="Picture"/>
-            <a:graphic>
-              <a:graphicData uri="http://schemas.openxmlformats.org/drawingml/2006/picture">
-                <pic:pic>
-                  <pic:nvPicPr>
-                    <pic:cNvPr descr="image/11.2beta_scan_all.csv.png" id="69" name="Picture"/>
-                    <pic:cNvPicPr>
-                      <a:picLocks noChangeArrowheads="1" noChangeAspect="1"/>
-                    </pic:cNvPicPr>
-                  </pic:nvPicPr>
-                  <pic:blipFill>
-                    <a:blip r:embed="rId67"/>
-                    <a:stretch>
-                      <a:fillRect/>
-                    </a:stretch>
-                  </pic:blipFill>
-                  <pic:spPr bwMode="auto">
-                    <a:xfrm>
-                      <a:off x="0" y="0"/>
-                      <a:ext cx="2400300" cy="1350168"/>
-                    </a:xfrm>
-                    <a:prstGeom prst="rect">
-                      <a:avLst/>
-                    </a:prstGeom>
-                    <a:noFill/>
-                    <a:ln w="9525">
-                      <a:noFill/>
-                      <a:headEnd/>
-                      <a:tailEnd/>
-                    </a:ln>
-                  </pic:spPr>
-                </pic:pic>
-              </a:graphicData>
-            </a:graphic>
-          </wp:inline>
-        </w:drawing>
-      </w:r>
-    </w:p>
-    <w:p>
-      <w:pPr>
-        <w:pStyle w:val="BodyText"/>
-      </w:pPr>
-      <w:r>
-        <w:t xml:space="preserve">Вывод:</w:t>
-      </w:r>
-    </w:p>
-    <w:p>
-      <w:pPr>
-        <w:pStyle w:val="Compact"/>
-        <w:numPr>
-          <w:ilvl w:val="0"/>
-          <w:numId w:val="1008"/>
-        </w:numPr>
-      </w:pPr>
-      <w:r>
-        <w:t xml:space="preserve">рост</w:t>
+        <w:t xml:space="preserve">Результат:</w:t>
+      </w:r>
+    </w:p>
+    <w:p>
+      <w:pPr>
+        <w:pStyle w:val="Compact"/>
+        <w:numPr>
+          <w:ilvl w:val="0"/>
+          <w:numId w:val="1011"/>
+        </w:numPr>
+      </w:pPr>
+      <w:r>
+        <w:t xml:space="preserve">оптимизация позволяет системно сравнивать сценарии;</w:t>
+      </w:r>
+    </w:p>
+    <w:p>
+      <w:pPr>
+        <w:pStyle w:val="Compact"/>
+        <w:numPr>
+          <w:ilvl w:val="0"/>
+          <w:numId w:val="1011"/>
+        </w:numPr>
+      </w:pPr>
+      <w:r>
+        <w:t xml:space="preserve">найденные комбинации параметров дают более благоприятный компромисс между скоростью распространения и масштабом вспышки;</w:t>
+      </w:r>
+    </w:p>
+    <w:p>
+      <w:pPr>
+        <w:pStyle w:val="Compact"/>
+        <w:numPr>
+          <w:ilvl w:val="0"/>
+          <w:numId w:val="1011"/>
+        </w:numPr>
+      </w:pPr>
+      <w:r>
+        <w:t xml:space="preserve">ограниченные ресурсы (например, интенсивность вмешательства) корректно учитываются в постановке.</w:t>
+      </w:r>
+    </w:p>
+    <w:bookmarkEnd w:id="93"/>
+    <w:bookmarkEnd w:id="94"/>
+    <w:bookmarkStart w:id="97" w:name="аналитическое-обобщение"/>
+    <w:p>
+      <w:pPr>
+        <w:pStyle w:val="Heading1"/>
+      </w:pPr>
+      <w:r>
+        <w:t xml:space="preserve">Аналитическое обобщение</w:t>
+      </w:r>
+    </w:p>
+    <w:bookmarkStart w:id="95" w:name="сравнение-сценариев"/>
+    <w:p>
+      <w:pPr>
+        <w:pStyle w:val="Heading2"/>
+      </w:pPr>
+      <w:r>
+        <w:t xml:space="preserve">Сравнение сценариев</w:t>
+      </w:r>
+    </w:p>
+    <w:tbl>
+      <w:tblPr>
+        <w:tblStyle w:val="Table"/>
+        <w:tblW w:type="auto" w:w="0"/>
+        <w:tblLook w:firstRow="1" w:lastRow="0" w:firstColumn="0" w:lastColumn="0" w:noHBand="0" w:noVBand="0" w:val="0020"/>
+      </w:tblPr>
+      <w:tblGrid>
+        <w:gridCol w:w="3960"/>
+        <w:gridCol w:w="3960"/>
+      </w:tblGrid>
+      <w:tr>
+        <w:trPr>
+          <w:tblHeader w:val="on"/>
+        </w:trPr>
+        <w:tc>
+          <w:tcPr/>
+          <w:p>
+            <w:pPr>
+              <w:pStyle w:val="Compact"/>
+            </w:pPr>
+            <w:r>
+              <w:t xml:space="preserve">Сценарий</w:t>
+            </w:r>
+          </w:p>
+        </w:tc>
+        <w:tc>
+          <w:tcPr/>
+          <w:p>
+            <w:pPr>
+              <w:pStyle w:val="Compact"/>
+            </w:pPr>
+            <w:r>
+              <w:t xml:space="preserve">Качественный эффект</w:t>
+            </w:r>
+          </w:p>
+        </w:tc>
+      </w:tr>
+      <w:tr>
+        <w:tc>
+          <w:tcPr/>
+          <w:p>
+            <w:pPr>
+              <w:pStyle w:val="Compact"/>
+            </w:pPr>
+            <w:r>
+              <w:t xml:space="preserve">Увеличение</w:t>
+            </w:r>
+            <w:r>
+              <w:t xml:space="preserve"> </w:t>
+            </w:r>
+            <w:r>
+              <w:rPr>
+                <w:rStyle w:val="VerbatimChar"/>
+              </w:rPr>
+              <w:t xml:space="preserve">beta</w:t>
+            </w:r>
+          </w:p>
+        </w:tc>
+        <w:tc>
+          <w:tcPr/>
+          <w:p>
+            <w:pPr>
+              <w:pStyle w:val="Compact"/>
+            </w:pPr>
+            <w:r>
+              <w:t xml:space="preserve">Рост пика, ускорение вспышки</w:t>
+            </w:r>
+          </w:p>
+        </w:tc>
+      </w:tr>
+      <w:tr>
+        <w:tc>
+          <w:tcPr/>
+          <w:p>
+            <w:pPr>
+              <w:pStyle w:val="Compact"/>
+            </w:pPr>
+            <w:r>
+              <w:t xml:space="preserve">Рост миграции</w:t>
+            </w:r>
+          </w:p>
+        </w:tc>
+        <w:tc>
+          <w:tcPr/>
+          <w:p>
+            <w:pPr>
+              <w:pStyle w:val="Compact"/>
+            </w:pPr>
+            <w:r>
+              <w:t xml:space="preserve">Быстрее межгрупповое распространение</w:t>
+            </w:r>
+          </w:p>
+        </w:tc>
+      </w:tr>
+      <w:tr>
+        <w:tc>
+          <w:tcPr/>
+          <w:p>
+            <w:pPr>
+              <w:pStyle w:val="Compact"/>
+            </w:pPr>
+            <w:r>
+              <w:t xml:space="preserve">Гетерогенность</w:t>
+            </w:r>
+          </w:p>
+        </w:tc>
+        <w:tc>
+          <w:tcPr/>
+          <w:p>
+            <w:pPr>
+              <w:pStyle w:val="Compact"/>
+            </w:pPr>
+            <w:r>
+              <w:t xml:space="preserve">Неравномерность риска и смещение пика</w:t>
+            </w:r>
+          </w:p>
+        </w:tc>
+      </w:tr>
+      <w:tr>
+        <w:tc>
+          <w:tcPr/>
+          <w:p>
+            <w:pPr>
+              <w:pStyle w:val="Compact"/>
+            </w:pPr>
+            <w:r>
+              <w:t xml:space="preserve">Карантин</w:t>
+            </w:r>
+          </w:p>
+        </w:tc>
+        <w:tc>
+          <w:tcPr/>
+          <w:p>
+            <w:pPr>
+              <w:pStyle w:val="Compact"/>
+            </w:pPr>
+            <w:r>
+              <w:t xml:space="preserve">Снижение пика, сглаживание кривой</w:t>
+            </w:r>
+          </w:p>
+        </w:tc>
+      </w:tr>
+      <w:tr>
+        <w:tc>
+          <w:tcPr/>
+          <w:p>
+            <w:pPr>
+              <w:pStyle w:val="Compact"/>
+            </w:pPr>
+            <w:r>
+              <w:t xml:space="preserve">Оптимизация</w:t>
+            </w:r>
+          </w:p>
+        </w:tc>
+        <w:tc>
+          <w:tcPr/>
+          <w:p>
+            <w:pPr>
+              <w:pStyle w:val="Compact"/>
+            </w:pPr>
+            <w:r>
+              <w:t xml:space="preserve">Поиск сбалансированных параметров</w:t>
+            </w:r>
+          </w:p>
+        </w:tc>
+      </w:tr>
+    </w:tbl>
+    <w:bookmarkEnd w:id="95"/>
+    <w:bookmarkStart w:id="96" w:name="практический-смысл-результатов"/>
+    <w:p>
+      <w:pPr>
+        <w:pStyle w:val="Heading2"/>
+      </w:pPr>
+      <w:r>
+        <w:t xml:space="preserve">Практический смысл результатов</w:t>
+      </w:r>
+    </w:p>
+    <w:p>
+      <w:pPr>
+        <w:pStyle w:val="FirstParagraph"/>
+      </w:pPr>
+      <w:r>
+        <w:t xml:space="preserve">Полученные данные показывают, что поведение системы определяется не одним параметром, а их сочетанием. Для прикладного планирования требуется:</w:t>
+      </w:r>
+    </w:p>
+    <w:p>
+      <w:pPr>
+        <w:pStyle w:val="Compact"/>
+        <w:numPr>
+          <w:ilvl w:val="0"/>
+          <w:numId w:val="1012"/>
+        </w:numPr>
+      </w:pPr>
+      <w:r>
+        <w:t xml:space="preserve">Проводить чувствительный анализ до принятия мер.</w:t>
+      </w:r>
+    </w:p>
+    <w:p>
+      <w:pPr>
+        <w:pStyle w:val="Compact"/>
+        <w:numPr>
+          <w:ilvl w:val="0"/>
+          <w:numId w:val="1012"/>
+        </w:numPr>
+      </w:pPr>
+      <w:r>
+        <w:t xml:space="preserve">Учитывать структуру популяции и мобильность.</w:t>
+      </w:r>
+    </w:p>
+    <w:p>
+      <w:pPr>
+        <w:pStyle w:val="Compact"/>
+        <w:numPr>
+          <w:ilvl w:val="0"/>
+          <w:numId w:val="1012"/>
+        </w:numPr>
+      </w:pPr>
+      <w:r>
+        <w:t xml:space="preserve">Комбинировать карантинные меры с параметрической настройкой.</w:t>
+      </w:r>
+    </w:p>
+    <w:bookmarkEnd w:id="96"/>
+    <w:bookmarkEnd w:id="97"/>
+    <w:bookmarkStart w:id="104" w:name="видеоматериалы"/>
+    <w:p>
+      <w:pPr>
+        <w:pStyle w:val="Heading1"/>
+      </w:pPr>
+      <w:r>
+        <w:t xml:space="preserve">Видеоматериалы</w:t>
+      </w:r>
+    </w:p>
+    <w:bookmarkStart w:id="100" w:name="выполнение-лабораторной-работы"/>
+    <w:p>
+      <w:pPr>
+        <w:pStyle w:val="Heading2"/>
+      </w:pPr>
+      <w:r>
+        <w:t xml:space="preserve">Выполнение лабораторной работы</w:t>
+      </w:r>
+    </w:p>
+    <w:p>
+      <w:pPr>
+        <w:pStyle w:val="Compact"/>
+        <w:numPr>
+          <w:ilvl w:val="0"/>
+          <w:numId w:val="1013"/>
+        </w:numPr>
+      </w:pPr>
+      <w:r>
+        <w:t xml:space="preserve">VK Video:</w:t>
       </w:r>
       <w:r>
         <w:t xml:space="preserve"> </w:t>
       </w:r>
-      <w:r>
-        <w:rPr>
-          <w:rStyle w:val="VerbatimChar"/>
-        </w:rPr>
-        <w:t xml:space="preserve">beta</w:t>
+      <w:hyperlink r:id="rId98">
+        <w:r>
+          <w:rPr>
+            <w:rStyle w:val="Hyperlink"/>
+          </w:rPr>
+          <w:t xml:space="preserve">https://vkvideo.ru/video-236906473_456239019?list=ln-ThHskPk8rN3Bj8lX7z</w:t>
+        </w:r>
+      </w:hyperlink>
+    </w:p>
+    <w:p>
+      <w:pPr>
+        <w:pStyle w:val="Compact"/>
+        <w:numPr>
+          <w:ilvl w:val="0"/>
+          <w:numId w:val="1013"/>
+        </w:numPr>
+      </w:pPr>
+      <w:r>
+        <w:t xml:space="preserve">RuTube:</w:t>
       </w:r>
       <w:r>
         <w:t xml:space="preserve"> </w:t>
       </w:r>
-      <w:r>
-        <w:t xml:space="preserve">приводит к росту пика заражения;</w:t>
-      </w:r>
-    </w:p>
-    <w:p>
-      <w:pPr>
-        <w:pStyle w:val="Compact"/>
-        <w:numPr>
-          <w:ilvl w:val="0"/>
-          <w:numId w:val="1008"/>
-        </w:numPr>
-      </w:pPr>
-      <w:r>
-        <w:t xml:space="preserve">наблюдается пороговая зона перехода к интенсивной вспышке.</w:t>
-      </w:r>
-    </w:p>
-    <w:bookmarkEnd w:id="70"/>
-    <w:bookmarkStart w:id="80" w:name="влияние-миграции"/>
+      <w:hyperlink r:id="rId99">
+        <w:r>
+          <w:rPr>
+            <w:rStyle w:val="Hyperlink"/>
+          </w:rPr>
+          <w:t xml:space="preserve">https://rutube.ru/video/e230a97c778dc4380eed8aa6b6c7dec8/</w:t>
+        </w:r>
+      </w:hyperlink>
+    </w:p>
+    <w:bookmarkEnd w:id="100"/>
+    <w:bookmarkStart w:id="103" w:name="отчёт-и-презентация"/>
     <w:p>
       <w:pPr>
         <w:pStyle w:val="Heading2"/>
       </w:pPr>
       <w:r>
-        <w:t xml:space="preserve">4. Влияние миграции</w:t>
-      </w:r>
-    </w:p>
-    <w:p>
-      <w:pPr>
-        <w:pStyle w:val="FirstParagraph"/>
-      </w:pPr>
-      <w:r>
-        <w:drawing>
-          <wp:inline>
-            <wp:extent cx="1920240" cy="1080135"/>
-            <wp:effectExtent b="0" l="0" r="0" t="0"/>
-            <wp:docPr descr="" title="" id="72" name="Picture"/>
-            <a:graphic>
-              <a:graphicData uri="http://schemas.openxmlformats.org/drawingml/2006/picture">
-                <pic:pic>
-                  <pic:nvPicPr>
-                    <pic:cNvPr descr="image/15.0sir_migration_effect.png" id="73" name="Picture"/>
-                    <pic:cNvPicPr>
-                      <a:picLocks noChangeArrowheads="1" noChangeAspect="1"/>
-                    </pic:cNvPicPr>
-                  </pic:nvPicPr>
-                  <pic:blipFill>
-                    <a:blip r:embed="rId71"/>
-                    <a:stretch>
-                      <a:fillRect/>
-                    </a:stretch>
-                  </pic:blipFill>
-                  <pic:spPr bwMode="auto">
-                    <a:xfrm>
-                      <a:off x="0" y="0"/>
-                      <a:ext cx="1920240" cy="1080135"/>
-                    </a:xfrm>
-                    <a:prstGeom prst="rect">
-                      <a:avLst/>
-                    </a:prstGeom>
-                    <a:noFill/>
-                    <a:ln w="9525">
-                      <a:noFill/>
-                      <a:headEnd/>
-                      <a:tailEnd/>
-                    </a:ln>
-                  </pic:spPr>
-                </pic:pic>
-              </a:graphicData>
-            </a:graphic>
-          </wp:inline>
-        </w:drawing>
+        <w:t xml:space="preserve">Отчёт и презентация</w:t>
+      </w:r>
+    </w:p>
+    <w:p>
+      <w:pPr>
+        <w:pStyle w:val="Compact"/>
+        <w:numPr>
+          <w:ilvl w:val="0"/>
+          <w:numId w:val="1014"/>
+        </w:numPr>
+      </w:pPr>
+      <w:r>
+        <w:t xml:space="preserve">VK Video:</w:t>
       </w:r>
       <w:r>
         <w:t xml:space="preserve"> </w:t>
       </w:r>
-      <w:r>
-        <w:drawing>
-          <wp:inline>
-            <wp:extent cx="3093720" cy="1740217"/>
-            <wp:effectExtent b="0" l="0" r="0" t="0"/>
-            <wp:docPr descr="" title="" id="75" name="Picture"/>
-            <a:graphic>
-              <a:graphicData uri="http://schemas.openxmlformats.org/drawingml/2006/picture">
-                <pic:pic>
-                  <pic:nvPicPr>
-                    <pic:cNvPr descr="image/15.1migration_effect.png" id="76" name="Picture"/>
-                    <pic:cNvPicPr>
-                      <a:picLocks noChangeArrowheads="1" noChangeAspect="1"/>
-                    </pic:cNvPicPr>
-                  </pic:nvPicPr>
-                  <pic:blipFill>
-                    <a:blip r:embed="rId74"/>
-                    <a:stretch>
-                      <a:fillRect/>
-                    </a:stretch>
-                  </pic:blipFill>
-                  <pic:spPr bwMode="auto">
-                    <a:xfrm>
-                      <a:off x="0" y="0"/>
-                      <a:ext cx="3093720" cy="1740217"/>
-                    </a:xfrm>
-                    <a:prstGeom prst="rect">
-                      <a:avLst/>
-                    </a:prstGeom>
-                    <a:noFill/>
-                    <a:ln w="9525">
-                      <a:noFill/>
-                      <a:headEnd/>
-                      <a:tailEnd/>
-                    </a:ln>
-                  </pic:spPr>
-                </pic:pic>
-              </a:graphicData>
-            </a:graphic>
-          </wp:inline>
-        </w:drawing>
-      </w:r>
-    </w:p>
-    <w:p>
-      <w:pPr>
-        <w:pStyle w:val="BodyText"/>
-      </w:pPr>
-      <w:r>
-        <w:drawing>
-          <wp:inline>
-            <wp:extent cx="2400300" cy="1350168"/>
-            <wp:effectExtent b="0" l="0" r="0" t="0"/>
-            <wp:docPr descr="" title="" id="78" name="Picture"/>
-            <a:graphic>
-              <a:graphicData uri="http://schemas.openxmlformats.org/drawingml/2006/picture">
-                <pic:pic>
-                  <pic:nvPicPr>
-                    <pic:cNvPr descr="image/15.2migration_scan_all.csv.png" id="79" name="Picture"/>
-                    <pic:cNvPicPr>
-                      <a:picLocks noChangeArrowheads="1" noChangeAspect="1"/>
-                    </pic:cNvPicPr>
-                  </pic:nvPicPr>
-                  <pic:blipFill>
-                    <a:blip r:embed="rId77"/>
-                    <a:stretch>
-                      <a:fillRect/>
-                    </a:stretch>
-                  </pic:blipFill>
-                  <pic:spPr bwMode="auto">
-                    <a:xfrm>
-                      <a:off x="0" y="0"/>
-                      <a:ext cx="2400300" cy="1350168"/>
-                    </a:xfrm>
-                    <a:prstGeom prst="rect">
-                      <a:avLst/>
-                    </a:prstGeom>
-                    <a:noFill/>
-                    <a:ln w="9525">
-                      <a:noFill/>
-                      <a:headEnd/>
-                      <a:tailEnd/>
-                    </a:ln>
-                  </pic:spPr>
-                </pic:pic>
-              </a:graphicData>
-            </a:graphic>
-          </wp:inline>
-        </w:drawing>
-      </w:r>
-    </w:p>
-    <w:p>
-      <w:pPr>
-        <w:pStyle w:val="BodyText"/>
-      </w:pPr>
-      <w:r>
-        <w:t xml:space="preserve">Вывод:</w:t>
-      </w:r>
-    </w:p>
-    <w:p>
-      <w:pPr>
-        <w:pStyle w:val="Compact"/>
-        <w:numPr>
-          <w:ilvl w:val="0"/>
-          <w:numId w:val="1009"/>
-        </w:numPr>
-      </w:pPr>
-      <w:r>
-        <w:t xml:space="preserve">ненулевая миграция ускоряет межгородское распространение;</w:t>
-      </w:r>
-    </w:p>
-    <w:p>
-      <w:pPr>
-        <w:pStyle w:val="Compact"/>
-        <w:numPr>
-          <w:ilvl w:val="0"/>
-          <w:numId w:val="1009"/>
-        </w:numPr>
-      </w:pPr>
-      <w:r>
-        <w:t xml:space="preserve">пик достигается раньше при более активном обмене агентами.</w:t>
-      </w:r>
-    </w:p>
-    <w:bookmarkEnd w:id="80"/>
-    <w:bookmarkStart w:id="87" w:name="оптимизация-параметров"/>
-    <w:p>
-      <w:pPr>
-        <w:pStyle w:val="Heading2"/>
-      </w:pPr>
-      <w:r>
-        <w:t xml:space="preserve">5. Оптимизация параметров</w:t>
-      </w:r>
-    </w:p>
-    <w:p>
-      <w:pPr>
-        <w:pStyle w:val="FirstParagraph"/>
-      </w:pPr>
-      <w:r>
-        <w:drawing>
-          <wp:inline>
-            <wp:extent cx="2400300" cy="1350168"/>
-            <wp:effectExtent b="0" l="0" r="0" t="0"/>
-            <wp:docPr descr="" title="" id="82" name="Picture"/>
-            <a:graphic>
-              <a:graphicData uri="http://schemas.openxmlformats.org/drawingml/2006/picture">
-                <pic:pic>
-                  <pic:nvPicPr>
-                    <pic:cNvPr descr="image/19sir_optimize_parameters.png" id="83" name="Picture"/>
-                    <pic:cNvPicPr>
-                      <a:picLocks noChangeArrowheads="1" noChangeAspect="1"/>
-                    </pic:cNvPicPr>
-                  </pic:nvPicPr>
-                  <pic:blipFill>
-                    <a:blip r:embed="rId81"/>
-                    <a:stretch>
-                      <a:fillRect/>
-                    </a:stretch>
-                  </pic:blipFill>
-                  <pic:spPr bwMode="auto">
-                    <a:xfrm>
-                      <a:off x="0" y="0"/>
-                      <a:ext cx="2400300" cy="1350168"/>
-                    </a:xfrm>
-                    <a:prstGeom prst="rect">
-                      <a:avLst/>
-                    </a:prstGeom>
-                    <a:noFill/>
-                    <a:ln w="9525">
-                      <a:noFill/>
-                      <a:headEnd/>
-                      <a:tailEnd/>
-                    </a:ln>
-                  </pic:spPr>
-                </pic:pic>
-              </a:graphicData>
-            </a:graphic>
-          </wp:inline>
-        </w:drawing>
+      <w:hyperlink r:id="rId101">
+        <w:r>
+          <w:rPr>
+            <w:rStyle w:val="Hyperlink"/>
+          </w:rPr>
+          <w:t xml:space="preserve">https://vkvideo.ru/video-236906473_456239020</w:t>
+        </w:r>
+      </w:hyperlink>
+    </w:p>
+    <w:p>
+      <w:pPr>
+        <w:pStyle w:val="Compact"/>
+        <w:numPr>
+          <w:ilvl w:val="0"/>
+          <w:numId w:val="1014"/>
+        </w:numPr>
+      </w:pPr>
+      <w:r>
+        <w:t xml:space="preserve">RuTube:</w:t>
       </w:r>
       <w:r>
         <w:t xml:space="preserve"> </w:t>
       </w:r>
-      <w:r>
-        <w:drawing>
-          <wp:inline>
-            <wp:extent cx="2667000" cy="1500187"/>
-            <wp:effectExtent b="0" l="0" r="0" t="0"/>
-            <wp:docPr descr="" title="" id="85" name="Picture"/>
-            <a:graphic>
-              <a:graphicData uri="http://schemas.openxmlformats.org/drawingml/2006/picture">
-                <pic:pic>
-                  <pic:nvPicPr>
-                    <pic:cNvPr descr="image/23.1comprehensive_analysis.png" id="86" name="Picture"/>
-                    <pic:cNvPicPr>
-                      <a:picLocks noChangeArrowheads="1" noChangeAspect="1"/>
-                    </pic:cNvPicPr>
-                  </pic:nvPicPr>
-                  <pic:blipFill>
-                    <a:blip r:embed="rId84"/>
-                    <a:stretch>
-                      <a:fillRect/>
-                    </a:stretch>
-                  </pic:blipFill>
-                  <pic:spPr bwMode="auto">
-                    <a:xfrm>
-                      <a:off x="0" y="0"/>
-                      <a:ext cx="2667000" cy="1500187"/>
-                    </a:xfrm>
-                    <a:prstGeom prst="rect">
-                      <a:avLst/>
-                    </a:prstGeom>
-                    <a:noFill/>
-                    <a:ln w="9525">
-                      <a:noFill/>
-                      <a:headEnd/>
-                      <a:tailEnd/>
-                    </a:ln>
-                  </pic:spPr>
-                </pic:pic>
-              </a:graphicData>
-            </a:graphic>
-          </wp:inline>
-        </w:drawing>
-      </w:r>
-    </w:p>
-    <w:p>
-      <w:pPr>
-        <w:pStyle w:val="BodyText"/>
-      </w:pPr>
-      <w:r>
-        <w:t xml:space="preserve">Вывод:</w:t>
-      </w:r>
-    </w:p>
-    <w:p>
-      <w:pPr>
-        <w:pStyle w:val="Compact"/>
-        <w:numPr>
-          <w:ilvl w:val="0"/>
-          <w:numId w:val="1010"/>
-        </w:numPr>
-      </w:pPr>
-      <w:r>
-        <w:t xml:space="preserve">оптимизационный блок позволяет подобрать параметры со снижением эпидемического ущерба;</w:t>
-      </w:r>
-    </w:p>
-    <w:p>
-      <w:pPr>
-        <w:pStyle w:val="Compact"/>
-        <w:numPr>
-          <w:ilvl w:val="0"/>
-          <w:numId w:val="1010"/>
-        </w:numPr>
-      </w:pPr>
-      <w:r>
-        <w:t xml:space="preserve">итоговая визуализация облегчает сравнительный анализ сценариев.</w:t>
-      </w:r>
-    </w:p>
-    <w:bookmarkEnd w:id="87"/>
-    <w:bookmarkEnd w:id="88"/>
-    <w:bookmarkStart w:id="126" w:name="дополнительные-задания"/>
+      <w:hyperlink r:id="rId102">
+        <w:r>
+          <w:rPr>
+            <w:rStyle w:val="Hyperlink"/>
+          </w:rPr>
+          <w:t xml:space="preserve">https://rutube.ru/video/ca906f162368016d3336242a0c0f068e/</w:t>
+        </w:r>
+      </w:hyperlink>
+    </w:p>
+    <w:bookmarkEnd w:id="103"/>
+    <w:bookmarkEnd w:id="104"/>
+    <w:bookmarkStart w:id="105" w:name="выводы"/>
     <w:p>
       <w:pPr>
         <w:pStyle w:val="Heading1"/>
       </w:pPr>
       <w:r>
-        <w:t xml:space="preserve">Дополнительные задания</w:t>
-      </w:r>
-    </w:p>
-    <w:bookmarkStart w:id="93" w:name="r0-и-порог-эпидемии"/>
-    <w:p>
-      <w:pPr>
-        <w:pStyle w:val="Heading2"/>
-      </w:pPr>
-      <w:r>
-        <w:t xml:space="preserve">1–2.</w:t>
-      </w:r>
-      <w:r>
-        <w:t xml:space="preserve"> </w:t>
-      </w:r>
-      <w:r>
-        <w:rPr>
-          <w:rStyle w:val="VerbatimChar"/>
-        </w:rPr>
-        <w:t xml:space="preserve">R0</w:t>
-      </w:r>
-      <w:r>
-        <w:t xml:space="preserve"> </w:t>
-      </w:r>
-      <w:r>
-        <w:t xml:space="preserve">и порог эпидемии</w:t>
-      </w:r>
-    </w:p>
-    <w:p>
-      <w:pPr>
-        <w:pStyle w:val="FirstParagraph"/>
-      </w:pPr>
-      <w:r>
-        <w:drawing>
-          <wp:inline>
-            <wp:extent cx="2400300" cy="1350168"/>
-            <wp:effectExtent b="0" l="0" r="0" t="0"/>
-            <wp:docPr descr="" title="" id="89" name="Picture"/>
-            <a:graphic>
-              <a:graphicData uri="http://schemas.openxmlformats.org/drawingml/2006/picture">
-                <pic:pic>
-                  <pic:nvPicPr>
-                    <pic:cNvPr descr="image/7.1sir_basic_dynamics.png" id="90" name="Picture"/>
-                    <pic:cNvPicPr>
-                      <a:picLocks noChangeArrowheads="1" noChangeAspect="1"/>
-                    </pic:cNvPicPr>
-                  </pic:nvPicPr>
-                  <pic:blipFill>
-                    <a:blip r:embed="rId47"/>
-                    <a:stretch>
-                      <a:fillRect/>
-                    </a:stretch>
-                  </pic:blipFill>
-                  <pic:spPr bwMode="auto">
-                    <a:xfrm>
-                      <a:off x="0" y="0"/>
-                      <a:ext cx="2400300" cy="1350168"/>
-                    </a:xfrm>
-                    <a:prstGeom prst="rect">
-                      <a:avLst/>
-                    </a:prstGeom>
-                    <a:noFill/>
-                    <a:ln w="9525">
-                      <a:noFill/>
-                      <a:headEnd/>
-                      <a:tailEnd/>
-                    </a:ln>
-                  </pic:spPr>
-                </pic:pic>
-              </a:graphicData>
-            </a:graphic>
-          </wp:inline>
-        </w:drawing>
-      </w:r>
-      <w:r>
-        <w:t xml:space="preserve"> </w:t>
-      </w:r>
-      <w:r>
-        <w:drawing>
-          <wp:inline>
-            <wp:extent cx="2400300" cy="1350168"/>
-            <wp:effectExtent b="0" l="0" r="0" t="0"/>
-            <wp:docPr descr="" title="" id="91" name="Picture"/>
-            <a:graphic>
-              <a:graphicData uri="http://schemas.openxmlformats.org/drawingml/2006/picture">
-                <pic:pic>
-                  <pic:nvPicPr>
-                    <pic:cNvPr descr="image/11.2beta_scan_all.csv.png" id="92" name="Picture"/>
-                    <pic:cNvPicPr>
-                      <a:picLocks noChangeArrowheads="1" noChangeAspect="1"/>
-                    </pic:cNvPicPr>
-                  </pic:nvPicPr>
-                  <pic:blipFill>
-                    <a:blip r:embed="rId67"/>
-                    <a:stretch>
-                      <a:fillRect/>
-                    </a:stretch>
-                  </pic:blipFill>
-                  <pic:spPr bwMode="auto">
-                    <a:xfrm>
-                      <a:off x="0" y="0"/>
-                      <a:ext cx="2400300" cy="1350168"/>
-                    </a:xfrm>
-                    <a:prstGeom prst="rect">
-                      <a:avLst/>
-                    </a:prstGeom>
-                    <a:noFill/>
-                    <a:ln w="9525">
-                      <a:noFill/>
-                      <a:headEnd/>
-                      <a:tailEnd/>
-                    </a:ln>
-                  </pic:spPr>
-                </pic:pic>
-              </a:graphicData>
-            </a:graphic>
-          </wp:inline>
-        </w:drawing>
-      </w:r>
-    </w:p>
-    <w:bookmarkEnd w:id="93"/>
-    <w:bookmarkStart w:id="103" w:name="гетерогенность"/>
-    <w:p>
-      <w:pPr>
-        <w:pStyle w:val="Heading2"/>
-      </w:pPr>
-      <w:r>
-        <w:t xml:space="preserve">3. Гетерогенность</w:t>
-      </w:r>
-    </w:p>
-    <w:p>
-      <w:pPr>
-        <w:pStyle w:val="FirstParagraph"/>
-      </w:pPr>
-      <w:r>
-        <w:drawing>
-          <wp:inline>
-            <wp:extent cx="1706880" cy="960120"/>
-            <wp:effectExtent b="0" l="0" r="0" t="0"/>
-            <wp:docPr descr="" title="" id="95" name="Picture"/>
-            <a:graphic>
-              <a:graphicData uri="http://schemas.openxmlformats.org/drawingml/2006/picture">
-                <pic:pic>
-                  <pic:nvPicPr>
-                    <pic:cNvPr descr="image/27.0sir_heterogeneity_effect.jl.png" id="96" name="Picture"/>
-                    <pic:cNvPicPr>
-                      <a:picLocks noChangeArrowheads="1" noChangeAspect="1"/>
-                    </pic:cNvPicPr>
-                  </pic:nvPicPr>
-                  <pic:blipFill>
-                    <a:blip r:embed="rId94"/>
-                    <a:stretch>
-                      <a:fillRect/>
-                    </a:stretch>
-                  </pic:blipFill>
-                  <pic:spPr bwMode="auto">
-                    <a:xfrm>
-                      <a:off x="0" y="0"/>
-                      <a:ext cx="1706880" cy="960120"/>
-                    </a:xfrm>
-                    <a:prstGeom prst="rect">
-                      <a:avLst/>
-                    </a:prstGeom>
-                    <a:noFill/>
-                    <a:ln w="9525">
-                      <a:noFill/>
-                      <a:headEnd/>
-                      <a:tailEnd/>
-                    </a:ln>
-                  </pic:spPr>
-                </pic:pic>
-              </a:graphicData>
-            </a:graphic>
-          </wp:inline>
-        </w:drawing>
-      </w:r>
-      <w:r>
-        <w:t xml:space="preserve"> </w:t>
-      </w:r>
-      <w:r>
-        <w:drawing>
-          <wp:inline>
-            <wp:extent cx="1706880" cy="960120"/>
-            <wp:effectExtent b="0" l="0" r="0" t="0"/>
-            <wp:docPr descr="" title="" id="98" name="Picture"/>
-            <a:graphic>
-              <a:graphicData uri="http://schemas.openxmlformats.org/drawingml/2006/picture">
-                <pic:pic>
-                  <pic:nvPicPr>
-                    <pic:cNvPr descr="image/27.1heterogeneity_effect.png" id="99" name="Picture"/>
-                    <pic:cNvPicPr>
-                      <a:picLocks noChangeArrowheads="1" noChangeAspect="1"/>
-                    </pic:cNvPicPr>
-                  </pic:nvPicPr>
-                  <pic:blipFill>
-                    <a:blip r:embed="rId97"/>
-                    <a:stretch>
-                      <a:fillRect/>
-                    </a:stretch>
-                  </pic:blipFill>
-                  <pic:spPr bwMode="auto">
-                    <a:xfrm>
-                      <a:off x="0" y="0"/>
-                      <a:ext cx="1706880" cy="960120"/>
-                    </a:xfrm>
-                    <a:prstGeom prst="rect">
-                      <a:avLst/>
-                    </a:prstGeom>
-                    <a:noFill/>
-                    <a:ln w="9525">
-                      <a:noFill/>
-                      <a:headEnd/>
-                      <a:tailEnd/>
-                    </a:ln>
-                  </pic:spPr>
-                </pic:pic>
-              </a:graphicData>
-            </a:graphic>
-          </wp:inline>
-        </w:drawing>
-      </w:r>
-      <w:r>
-        <w:t xml:space="preserve"> </w:t>
-      </w:r>
-      <w:r>
-        <w:drawing>
-          <wp:inline>
-            <wp:extent cx="1706880" cy="960120"/>
-            <wp:effectExtent b="0" l="0" r="0" t="0"/>
-            <wp:docPr descr="" title="" id="101" name="Picture"/>
-            <a:graphic>
-              <a:graphicData uri="http://schemas.openxmlformats.org/drawingml/2006/picture">
-                <pic:pic>
-                  <pic:nvPicPr>
-                    <pic:cNvPr descr="image/27.3heterogeneity_summary.csv.png" id="102" name="Picture"/>
-                    <pic:cNvPicPr>
-                      <a:picLocks noChangeArrowheads="1" noChangeAspect="1"/>
-                    </pic:cNvPicPr>
-                  </pic:nvPicPr>
-                  <pic:blipFill>
-                    <a:blip r:embed="rId100"/>
-                    <a:stretch>
-                      <a:fillRect/>
-                    </a:stretch>
-                  </pic:blipFill>
-                  <pic:spPr bwMode="auto">
-                    <a:xfrm>
-                      <a:off x="0" y="0"/>
-                      <a:ext cx="1706880" cy="960120"/>
-                    </a:xfrm>
-                    <a:prstGeom prst="rect">
-                      <a:avLst/>
-                    </a:prstGeom>
-                    <a:noFill/>
-                    <a:ln w="9525">
-                      <a:noFill/>
-                      <a:headEnd/>
-                      <a:tailEnd/>
-                    </a:ln>
-                  </pic:spPr>
-                </pic:pic>
-              </a:graphicData>
-            </a:graphic>
-          </wp:inline>
-        </w:drawing>
-      </w:r>
-    </w:p>
-    <w:bookmarkEnd w:id="103"/>
-    <w:bookmarkStart w:id="108" w:name="миграция"/>
-    <w:p>
-      <w:pPr>
-        <w:pStyle w:val="Heading2"/>
-      </w:pPr>
-      <w:r>
-        <w:t xml:space="preserve">4. Миграция</w:t>
-      </w:r>
-    </w:p>
-    <w:p>
-      <w:pPr>
-        <w:pStyle w:val="FirstParagraph"/>
-      </w:pPr>
-      <w:r>
-        <w:drawing>
-          <wp:inline>
-            <wp:extent cx="2560320" cy="1440180"/>
-            <wp:effectExtent b="0" l="0" r="0" t="0"/>
-            <wp:docPr descr="" title="" id="104" name="Picture"/>
-            <a:graphic>
-              <a:graphicData uri="http://schemas.openxmlformats.org/drawingml/2006/picture">
-                <pic:pic>
-                  <pic:nvPicPr>
-                    <pic:cNvPr descr="image/15.1migration_effect.png" id="105" name="Picture"/>
-                    <pic:cNvPicPr>
-                      <a:picLocks noChangeArrowheads="1" noChangeAspect="1"/>
-                    </pic:cNvPicPr>
-                  </pic:nvPicPr>
-                  <pic:blipFill>
-                    <a:blip r:embed="rId74"/>
-                    <a:stretch>
-                      <a:fillRect/>
-                    </a:stretch>
-                  </pic:blipFill>
-                  <pic:spPr bwMode="auto">
-                    <a:xfrm>
-                      <a:off x="0" y="0"/>
-                      <a:ext cx="2560320" cy="1440180"/>
-                    </a:xfrm>
-                    <a:prstGeom prst="rect">
-                      <a:avLst/>
-                    </a:prstGeom>
-                    <a:noFill/>
-                    <a:ln w="9525">
-                      <a:noFill/>
-                      <a:headEnd/>
-                      <a:tailEnd/>
-                    </a:ln>
-                  </pic:spPr>
-                </pic:pic>
-              </a:graphicData>
-            </a:graphic>
-          </wp:inline>
-        </w:drawing>
-      </w:r>
-      <w:r>
-        <w:t xml:space="preserve"> </w:t>
-      </w:r>
-      <w:r>
-        <w:drawing>
-          <wp:inline>
-            <wp:extent cx="2560320" cy="1440180"/>
-            <wp:effectExtent b="0" l="0" r="0" t="0"/>
-            <wp:docPr descr="" title="" id="106" name="Picture"/>
-            <a:graphic>
-              <a:graphicData uri="http://schemas.openxmlformats.org/drawingml/2006/picture">
-                <pic:pic>
-                  <pic:nvPicPr>
-                    <pic:cNvPr descr="image/15.2migration_scan_all.csv.png" id="107" name="Picture"/>
-                    <pic:cNvPicPr>
-                      <a:picLocks noChangeArrowheads="1" noChangeAspect="1"/>
-                    </pic:cNvPicPr>
-                  </pic:nvPicPr>
-                  <pic:blipFill>
-                    <a:blip r:embed="rId77"/>
-                    <a:stretch>
-                      <a:fillRect/>
-                    </a:stretch>
-                  </pic:blipFill>
-                  <pic:spPr bwMode="auto">
-                    <a:xfrm>
-                      <a:off x="0" y="0"/>
-                      <a:ext cx="2560320" cy="1440180"/>
-                    </a:xfrm>
-                    <a:prstGeom prst="rect">
-                      <a:avLst/>
-                    </a:prstGeom>
-                    <a:noFill/>
-                    <a:ln w="9525">
-                      <a:noFill/>
-                      <a:headEnd/>
-                      <a:tailEnd/>
-                    </a:ln>
-                  </pic:spPr>
-                </pic:pic>
-              </a:graphicData>
-            </a:graphic>
-          </wp:inline>
-        </w:drawing>
-      </w:r>
-    </w:p>
-    <w:bookmarkEnd w:id="108"/>
-    <w:bookmarkStart w:id="118" w:name="карантин"/>
-    <w:p>
-      <w:pPr>
-        <w:pStyle w:val="Heading2"/>
-      </w:pPr>
-      <w:r>
-        <w:t xml:space="preserve">5. Карантин</w:t>
-      </w:r>
-    </w:p>
-    <w:p>
-      <w:pPr>
-        <w:pStyle w:val="FirstParagraph"/>
-      </w:pPr>
-      <w:r>
-        <w:drawing>
-          <wp:inline>
-            <wp:extent cx="1706880" cy="960120"/>
-            <wp:effectExtent b="0" l="0" r="0" t="0"/>
-            <wp:docPr descr="" title="" id="110" name="Picture"/>
-            <a:graphic>
-              <a:graphicData uri="http://schemas.openxmlformats.org/drawingml/2006/picture">
-                <pic:pic>
-                  <pic:nvPicPr>
-                    <pic:cNvPr descr="image/31.0sir_quarantine_effect.png" id="111" name="Picture"/>
-                    <pic:cNvPicPr>
-                      <a:picLocks noChangeArrowheads="1" noChangeAspect="1"/>
-                    </pic:cNvPicPr>
-                  </pic:nvPicPr>
-                  <pic:blipFill>
-                    <a:blip r:embed="rId109"/>
-                    <a:stretch>
-                      <a:fillRect/>
-                    </a:stretch>
-                  </pic:blipFill>
-                  <pic:spPr bwMode="auto">
-                    <a:xfrm>
-                      <a:off x="0" y="0"/>
-                      <a:ext cx="1706880" cy="960120"/>
-                    </a:xfrm>
-                    <a:prstGeom prst="rect">
-                      <a:avLst/>
-                    </a:prstGeom>
-                    <a:noFill/>
-                    <a:ln w="9525">
-                      <a:noFill/>
-                      <a:headEnd/>
-                      <a:tailEnd/>
-                    </a:ln>
-                  </pic:spPr>
-                </pic:pic>
-              </a:graphicData>
-            </a:graphic>
-          </wp:inline>
-        </w:drawing>
-      </w:r>
-      <w:r>
-        <w:t xml:space="preserve"> </w:t>
-      </w:r>
-      <w:r>
-        <w:drawing>
-          <wp:inline>
-            <wp:extent cx="1706880" cy="960120"/>
-            <wp:effectExtent b="0" l="0" r="0" t="0"/>
-            <wp:docPr descr="" title="" id="113" name="Picture"/>
-            <a:graphic>
-              <a:graphicData uri="http://schemas.openxmlformats.org/drawingml/2006/picture">
-                <pic:pic>
-                  <pic:nvPicPr>
-                    <pic:cNvPr descr="image/31.1quarantine_effect.png" id="114" name="Picture"/>
-                    <pic:cNvPicPr>
-                      <a:picLocks noChangeArrowheads="1" noChangeAspect="1"/>
-                    </pic:cNvPicPr>
-                  </pic:nvPicPr>
-                  <pic:blipFill>
-                    <a:blip r:embed="rId112"/>
-                    <a:stretch>
-                      <a:fillRect/>
-                    </a:stretch>
-                  </pic:blipFill>
-                  <pic:spPr bwMode="auto">
-                    <a:xfrm>
-                      <a:off x="0" y="0"/>
-                      <a:ext cx="1706880" cy="960120"/>
-                    </a:xfrm>
-                    <a:prstGeom prst="rect">
-                      <a:avLst/>
-                    </a:prstGeom>
-                    <a:noFill/>
-                    <a:ln w="9525">
-                      <a:noFill/>
-                      <a:headEnd/>
-                      <a:tailEnd/>
-                    </a:ln>
-                  </pic:spPr>
-                </pic:pic>
-              </a:graphicData>
-            </a:graphic>
-          </wp:inline>
-        </w:drawing>
-      </w:r>
-      <w:r>
-        <w:t xml:space="preserve"> </w:t>
-      </w:r>
-      <w:r>
-        <w:drawing>
-          <wp:inline>
-            <wp:extent cx="1706880" cy="960120"/>
-            <wp:effectExtent b="0" l="0" r="0" t="0"/>
-            <wp:docPr descr="" title="" id="116" name="Picture"/>
-            <a:graphic>
-              <a:graphicData uri="http://schemas.openxmlformats.org/drawingml/2006/picture">
-                <pic:pic>
-                  <pic:nvPicPr>
-                    <pic:cNvPr descr="image/31.4quarantine_summary.csv.png" id="117" name="Picture"/>
-                    <pic:cNvPicPr>
-                      <a:picLocks noChangeArrowheads="1" noChangeAspect="1"/>
-                    </pic:cNvPicPr>
-                  </pic:nvPicPr>
-                  <pic:blipFill>
-                    <a:blip r:embed="rId115"/>
-                    <a:stretch>
-                      <a:fillRect/>
-                    </a:stretch>
-                  </pic:blipFill>
-                  <pic:spPr bwMode="auto">
-                    <a:xfrm>
-                      <a:off x="0" y="0"/>
-                      <a:ext cx="1706880" cy="960120"/>
-                    </a:xfrm>
-                    <a:prstGeom prst="rect">
-                      <a:avLst/>
-                    </a:prstGeom>
-                    <a:noFill/>
-                    <a:ln w="9525">
-                      <a:noFill/>
-                      <a:headEnd/>
-                      <a:tailEnd/>
-                    </a:ln>
-                  </pic:spPr>
-                </pic:pic>
-              </a:graphicData>
-            </a:graphic>
-          </wp:inline>
-        </w:drawing>
-      </w:r>
-    </w:p>
-    <w:bookmarkEnd w:id="118"/>
-    <w:bookmarkStart w:id="125" w:name="оптимизация-с-ограничением"/>
-    <w:p>
-      <w:pPr>
-        <w:pStyle w:val="Heading2"/>
-      </w:pPr>
-      <w:r>
-        <w:t xml:space="preserve">6. Оптимизация с ограничением</w:t>
-      </w:r>
-    </w:p>
-    <w:p>
-      <w:pPr>
-        <w:pStyle w:val="FirstParagraph"/>
-      </w:pPr>
-      <w:r>
-        <w:drawing>
-          <wp:inline>
-            <wp:extent cx="2400300" cy="1350168"/>
-            <wp:effectExtent b="0" l="0" r="0" t="0"/>
-            <wp:docPr descr="" title="" id="120" name="Picture"/>
-            <a:graphic>
-              <a:graphicData uri="http://schemas.openxmlformats.org/drawingml/2006/picture">
-                <pic:pic>
-                  <pic:nvPicPr>
-                    <pic:cNvPr descr="image/35sir_optimize_with_constraint.png" id="121" name="Picture"/>
-                    <pic:cNvPicPr>
-                      <a:picLocks noChangeArrowheads="1" noChangeAspect="1"/>
-                    </pic:cNvPicPr>
-                  </pic:nvPicPr>
-                  <pic:blipFill>
-                    <a:blip r:embed="rId119"/>
-                    <a:stretch>
-                      <a:fillRect/>
-                    </a:stretch>
-                  </pic:blipFill>
-                  <pic:spPr bwMode="auto">
-                    <a:xfrm>
-                      <a:off x="0" y="0"/>
-                      <a:ext cx="2400300" cy="1350168"/>
-                    </a:xfrm>
-                    <a:prstGeom prst="rect">
-                      <a:avLst/>
-                    </a:prstGeom>
-                    <a:noFill/>
-                    <a:ln w="9525">
-                      <a:noFill/>
-                      <a:headEnd/>
-                      <a:tailEnd/>
-                    </a:ln>
-                  </pic:spPr>
-                </pic:pic>
-              </a:graphicData>
-            </a:graphic>
-          </wp:inline>
-        </w:drawing>
-      </w:r>
-      <w:r>
-        <w:t xml:space="preserve"> </w:t>
-      </w:r>
-      <w:r>
-        <w:drawing>
-          <wp:inline>
-            <wp:extent cx="2400300" cy="1350168"/>
-            <wp:effectExtent b="0" l="0" r="0" t="0"/>
-            <wp:docPr descr="" title="" id="123" name="Picture"/>
-            <a:graphic>
-              <a:graphicData uri="http://schemas.openxmlformats.org/drawingml/2006/picture">
-                <pic:pic>
-                  <pic:nvPicPr>
-                    <pic:cNvPr descr="image/38.1optimization_with_constraint.csv.png" id="124" name="Picture"/>
-                    <pic:cNvPicPr>
-                      <a:picLocks noChangeArrowheads="1" noChangeAspect="1"/>
-                    </pic:cNvPicPr>
-                  </pic:nvPicPr>
-                  <pic:blipFill>
-                    <a:blip r:embed="rId122"/>
-                    <a:stretch>
-                      <a:fillRect/>
-                    </a:stretch>
-                  </pic:blipFill>
-                  <pic:spPr bwMode="auto">
-                    <a:xfrm>
-                      <a:off x="0" y="0"/>
-                      <a:ext cx="2400300" cy="1350168"/>
-                    </a:xfrm>
-                    <a:prstGeom prst="rect">
-                      <a:avLst/>
-                    </a:prstGeom>
-                    <a:noFill/>
-                    <a:ln w="9525">
-                      <a:noFill/>
-                      <a:headEnd/>
-                      <a:tailEnd/>
-                    </a:ln>
-                  </pic:spPr>
-                </pic:pic>
-              </a:graphicData>
-            </a:graphic>
-          </wp:inline>
-        </w:drawing>
-      </w:r>
-    </w:p>
-    <w:bookmarkEnd w:id="125"/>
-    <w:bookmarkEnd w:id="126"/>
-    <w:bookmarkStart w:id="129" w:name="итоги"/>
-    <w:p>
-      <w:pPr>
-        <w:pStyle w:val="Heading1"/>
-      </w:pPr>
-      <w:r>
-        <w:t xml:space="preserve">Итоги</w:t>
-      </w:r>
-    </w:p>
-    <w:bookmarkStart w:id="127" w:name="основные-результаты"/>
-    <w:p>
-      <w:pPr>
-        <w:pStyle w:val="Heading2"/>
-      </w:pPr>
-      <w:r>
-        <w:t xml:space="preserve">Основные результаты</w:t>
-      </w:r>
-    </w:p>
-    <w:p>
-      <w:pPr>
-        <w:pStyle w:val="Compact"/>
-        <w:numPr>
-          <w:ilvl w:val="0"/>
-          <w:numId w:val="1011"/>
-        </w:numPr>
-      </w:pPr>
-      <w:r>
-        <w:t xml:space="preserve">Реализован агентный вариант SIR-модели с расширениями.</w:t>
-      </w:r>
-    </w:p>
-    <w:p>
-      <w:pPr>
-        <w:pStyle w:val="Compact"/>
-        <w:numPr>
-          <w:ilvl w:val="0"/>
-          <w:numId w:val="1011"/>
-        </w:numPr>
-      </w:pPr>
-      <w:r>
-        <w:t xml:space="preserve">Проведены базовые и расширенные эксперименты.</w:t>
-      </w:r>
-    </w:p>
-    <w:p>
-      <w:pPr>
-        <w:pStyle w:val="Compact"/>
-        <w:numPr>
-          <w:ilvl w:val="0"/>
-          <w:numId w:val="1011"/>
-        </w:numPr>
-      </w:pPr>
-      <w:r>
-        <w:t xml:space="preserve">Получены данные для анализа порога, гетерогенности, миграции, карантина и оптимизации.</w:t>
-      </w:r>
-    </w:p>
-    <w:p>
-      <w:pPr>
-        <w:pStyle w:val="Compact"/>
-        <w:numPr>
-          <w:ilvl w:val="0"/>
-          <w:numId w:val="1011"/>
-        </w:numPr>
-      </w:pPr>
-      <w:r>
-        <w:t xml:space="preserve">Подготовлены материалы для защиты: отчёт, презентация, релизные файлы.</w:t>
-      </w:r>
-    </w:p>
-    <w:bookmarkEnd w:id="127"/>
-    <w:bookmarkStart w:id="128" w:name="практическая-ценность"/>
-    <w:p>
-      <w:pPr>
-        <w:pStyle w:val="Heading2"/>
-      </w:pPr>
-      <w:r>
-        <w:t xml:space="preserve">Практическая ценность</w:t>
-      </w:r>
-    </w:p>
-    <w:p>
-      <w:pPr>
-        <w:pStyle w:val="Compact"/>
-        <w:numPr>
-          <w:ilvl w:val="0"/>
-          <w:numId w:val="1012"/>
-        </w:numPr>
-      </w:pPr>
-      <w:r>
-        <w:t xml:space="preserve">Модель демонстрирует влияние параметров и управленческих мер на эпидемическую динамику.</w:t>
-      </w:r>
-    </w:p>
-    <w:p>
-      <w:pPr>
-        <w:pStyle w:val="Compact"/>
-        <w:numPr>
-          <w:ilvl w:val="0"/>
-          <w:numId w:val="1012"/>
-        </w:numPr>
-      </w:pPr>
-      <w:r>
-        <w:t xml:space="preserve">Подход пригоден для сценарного анализа и сравнения стратегий вмешательства.</w:t>
-      </w:r>
-    </w:p>
-    <w:bookmarkEnd w:id="128"/>
-    <w:bookmarkEnd w:id="129"/>
+        <w:t xml:space="preserve">Выводы</w:t>
+      </w:r>
+    </w:p>
+    <w:p>
+      <w:pPr>
+        <w:pStyle w:val="Compact"/>
+        <w:numPr>
+          <w:ilvl w:val="0"/>
+          <w:numId w:val="1015"/>
+        </w:numPr>
+      </w:pPr>
+      <w:r>
+        <w:t xml:space="preserve">Агентная реализация SIR-модели успешно выполнена и протестирована на серии сценариев.</w:t>
+      </w:r>
+    </w:p>
+    <w:p>
+      <w:pPr>
+        <w:pStyle w:val="Compact"/>
+        <w:numPr>
+          <w:ilvl w:val="0"/>
+          <w:numId w:val="1015"/>
+        </w:numPr>
+      </w:pPr>
+      <w:r>
+        <w:t xml:space="preserve">Подтверждена высокая чувствительность динамики к параметрам передачи и мобильности.</w:t>
+      </w:r>
+    </w:p>
+    <w:p>
+      <w:pPr>
+        <w:pStyle w:val="Compact"/>
+        <w:numPr>
+          <w:ilvl w:val="0"/>
+          <w:numId w:val="1015"/>
+        </w:numPr>
+      </w:pPr>
+      <w:r>
+        <w:t xml:space="preserve">Показано, что гетерогенность и организационные меры существенно меняют эпидемическую кривую.</w:t>
+      </w:r>
+    </w:p>
+    <w:p>
+      <w:pPr>
+        <w:pStyle w:val="Compact"/>
+        <w:numPr>
+          <w:ilvl w:val="0"/>
+          <w:numId w:val="1015"/>
+        </w:numPr>
+      </w:pPr>
+      <w:r>
+        <w:t xml:space="preserve">Оптимизационный подход полезен для выбора практических параметров управления.</w:t>
+      </w:r>
+    </w:p>
+    <w:p>
+      <w:pPr>
+        <w:pStyle w:val="Compact"/>
+        <w:numPr>
+          <w:ilvl w:val="0"/>
+          <w:numId w:val="1015"/>
+        </w:numPr>
+      </w:pPr>
+      <w:r>
+        <w:t xml:space="preserve">Подготовленный комплект материалов (код, графики, отчёт, презентация, релиз) обеспечивает воспроизводимость результатов ЛР4.</w:t>
+      </w:r>
+    </w:p>
+    <w:bookmarkEnd w:id="105"/>
     <w:sectPr>
       <w:footnotePr>
         <w:numRestart w:val="eachSect"/>
@@ -3038,7 +3364,70 @@
     <w:abstractNumId w:val="991"/>
   </w:num>
   <w:num w:numId="1012">
+    <w:abstractNumId w:val="99411"/>
+    <w:lvlOverride w:ilvl="0">
+      <w:startOverride w:val="1"/>
+    </w:lvlOverride>
+    <w:lvlOverride w:ilvl="1">
+      <w:startOverride w:val="1"/>
+    </w:lvlOverride>
+    <w:lvlOverride w:ilvl="2">
+      <w:startOverride w:val="1"/>
+    </w:lvlOverride>
+    <w:lvlOverride w:ilvl="3">
+      <w:startOverride w:val="1"/>
+    </w:lvlOverride>
+    <w:lvlOverride w:ilvl="4">
+      <w:startOverride w:val="1"/>
+    </w:lvlOverride>
+    <w:lvlOverride w:ilvl="5">
+      <w:startOverride w:val="1"/>
+    </w:lvlOverride>
+    <w:lvlOverride w:ilvl="6">
+      <w:startOverride w:val="1"/>
+    </w:lvlOverride>
+    <w:lvlOverride w:ilvl="7">
+      <w:startOverride w:val="1"/>
+    </w:lvlOverride>
+    <w:lvlOverride w:ilvl="8">
+      <w:startOverride w:val="1"/>
+    </w:lvlOverride>
+  </w:num>
+  <w:num w:numId="1013">
     <w:abstractNumId w:val="991"/>
+  </w:num>
+  <w:num w:numId="1014">
+    <w:abstractNumId w:val="991"/>
+  </w:num>
+  <w:num w:numId="1015">
+    <w:abstractNumId w:val="99411"/>
+    <w:lvlOverride w:ilvl="0">
+      <w:startOverride w:val="1"/>
+    </w:lvlOverride>
+    <w:lvlOverride w:ilvl="1">
+      <w:startOverride w:val="1"/>
+    </w:lvlOverride>
+    <w:lvlOverride w:ilvl="2">
+      <w:startOverride w:val="1"/>
+    </w:lvlOverride>
+    <w:lvlOverride w:ilvl="3">
+      <w:startOverride w:val="1"/>
+    </w:lvlOverride>
+    <w:lvlOverride w:ilvl="4">
+      <w:startOverride w:val="1"/>
+    </w:lvlOverride>
+    <w:lvlOverride w:ilvl="5">
+      <w:startOverride w:val="1"/>
+    </w:lvlOverride>
+    <w:lvlOverride w:ilvl="6">
+      <w:startOverride w:val="1"/>
+    </w:lvlOverride>
+    <w:lvlOverride w:ilvl="7">
+      <w:startOverride w:val="1"/>
+    </w:lvlOverride>
+    <w:lvlOverride w:ilvl="8">
+      <w:startOverride w:val="1"/>
+    </w:lvlOverride>
   </w:num>
 </w:numbering>
 </file>

</xml_diff>